<commit_message>
chore(rapport): Amélioration de l'expression orthographique et amélioration de la précision des textes.
</commit_message>
<xml_diff>
--- a/doc/sources/AugustoRomain-I320-ShootMeUp-Rapport.docx
+++ b/doc/sources/AugustoRomain-I320-ShootMeUp-Rapport.docx
@@ -1351,7 +1351,11 @@
           </mc:Choice>
           <mc:Fallback>
             <w:pict>
-              <v:shape w14:anchorId="281DD82F" id="_x0000_s1027" type="#_x0000_t202" style="position:absolute;margin-left:-37.85pt;margin-top:149.1pt;width:262.7pt;height:117.75pt;z-index:-251651072;visibility:visible;mso-wrap-style:square;mso-width-percent:0;mso-height-percent:0;mso-wrap-distance-left:9pt;mso-wrap-distance-top:3.6pt;mso-wrap-distance-right:9pt;mso-wrap-distance-bottom:3.6pt;mso-position-horizontal:absolute;mso-position-horizontal-relative:text;mso-position-vertical:absolute;mso-position-vertical-relative:text;mso-width-percent:0;mso-height-percent:0;mso-width-relative:margin;mso-height-relative:margin;v-text-anchor:top" o:gfxdata="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" filled="f" stroked="f">
+              <v:shapetype w14:anchorId="281DD82F" id="_x0000_t202" coordsize="21600,21600" o:spt="202" path="m,l,21600r21600,l21600,xe">
+                <v:stroke joinstyle="miter"/>
+                <v:path gradientshapeok="t" o:connecttype="rect"/>
+              </v:shapetype>
+              <v:shape id="_x0000_s1027" type="#_x0000_t202" style="position:absolute;margin-left:-37.85pt;margin-top:149.1pt;width:262.7pt;height:117.75pt;z-index:-251651072;visibility:visible;mso-wrap-style:square;mso-width-percent:0;mso-height-percent:0;mso-wrap-distance-left:9pt;mso-wrap-distance-top:3.6pt;mso-wrap-distance-right:9pt;mso-wrap-distance-bottom:3.6pt;mso-position-horizontal:absolute;mso-position-horizontal-relative:text;mso-position-vertical:absolute;mso-position-vertical-relative:text;mso-width-percent:0;mso-height-percent:0;mso-width-relative:margin;mso-height-relative:margin;v-text-anchor:top" o:gfxdata="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" filled="f" stroked="f">
                 <v:textbox>
                   <w:txbxContent>
                     <w:tbl>
@@ -1763,7 +1767,7 @@
           <w:r>
             <w:fldChar w:fldCharType="separate"/>
           </w:r>
-          <w:hyperlink w:anchor="_Toc240030430" w:history="1">
+          <w:hyperlink w:anchor="_Toc240034949" w:history="1">
             <w:r>
               <w:rPr>
                 <w:rStyle w:val="Lienhypertexte"/>
@@ -1787,7 +1791,7 @@
               <w:rPr>
                 <w:webHidden/>
               </w:rPr>
-              <w:instrText xml:space="preserve"> PAGEREF _Toc240030430 \h </w:instrText>
+              <w:instrText xml:space="preserve"> PAGEREF _Toc240034949 \h </w:instrText>
             </w:r>
             <w:r>
               <w:rPr>
@@ -1826,7 +1830,7 @@
               <w:lang w:eastAsia="fr-CH"/>
             </w:rPr>
           </w:pPr>
-          <w:hyperlink w:anchor="_Toc240030431" w:history="1">
+          <w:hyperlink w:anchor="_Toc240034950" w:history="1">
             <w:r>
               <w:rPr>
                 <w:rStyle w:val="Lienhypertexte"/>
@@ -1856,7 +1860,7 @@
                 <w:noProof/>
                 <w:webHidden/>
               </w:rPr>
-              <w:instrText xml:space="preserve"> PAGEREF _Toc240030431 \h </w:instrText>
+              <w:instrText xml:space="preserve"> PAGEREF _Toc240034950 \h </w:instrText>
             </w:r>
             <w:r>
               <w:rPr>
@@ -1899,7 +1903,7 @@
               <w:lang w:eastAsia="fr-CH"/>
             </w:rPr>
           </w:pPr>
-          <w:hyperlink w:anchor="_Toc240030432" w:history="1">
+          <w:hyperlink w:anchor="_Toc240034951" w:history="1">
             <w:r>
               <w:rPr>
                 <w:rStyle w:val="Lienhypertexte"/>
@@ -1929,7 +1933,7 @@
                 <w:noProof/>
                 <w:webHidden/>
               </w:rPr>
-              <w:instrText xml:space="preserve"> PAGEREF _Toc240030432 \h </w:instrText>
+              <w:instrText xml:space="preserve"> PAGEREF _Toc240034951 \h </w:instrText>
             </w:r>
             <w:r>
               <w:rPr>
@@ -1970,7 +1974,7 @@
               <w:lang w:eastAsia="fr-CH"/>
             </w:rPr>
           </w:pPr>
-          <w:hyperlink w:anchor="_Toc240030433" w:history="1">
+          <w:hyperlink w:anchor="_Toc240034952" w:history="1">
             <w:r>
               <w:rPr>
                 <w:rStyle w:val="Lienhypertexte"/>
@@ -1994,7 +1998,7 @@
               <w:rPr>
                 <w:webHidden/>
               </w:rPr>
-              <w:instrText xml:space="preserve"> PAGEREF _Toc240030433 \h </w:instrText>
+              <w:instrText xml:space="preserve"> PAGEREF _Toc240034952 \h </w:instrText>
             </w:r>
             <w:r>
               <w:rPr>
@@ -2033,7 +2037,7 @@
               <w:lang w:eastAsia="fr-CH"/>
             </w:rPr>
           </w:pPr>
-          <w:hyperlink w:anchor="_Toc240030434" w:history="1">
+          <w:hyperlink w:anchor="_Toc240034953" w:history="1">
             <w:r>
               <w:rPr>
                 <w:rStyle w:val="Lienhypertexte"/>
@@ -2063,7 +2067,7 @@
                 <w:noProof/>
                 <w:webHidden/>
               </w:rPr>
-              <w:instrText xml:space="preserve"> PAGEREF _Toc240030434 \h </w:instrText>
+              <w:instrText xml:space="preserve"> PAGEREF _Toc240034953 \h </w:instrText>
             </w:r>
             <w:r>
               <w:rPr>
@@ -2106,7 +2110,7 @@
               <w:lang w:eastAsia="fr-CH"/>
             </w:rPr>
           </w:pPr>
-          <w:hyperlink w:anchor="_Toc240030435" w:history="1">
+          <w:hyperlink w:anchor="_Toc240034954" w:history="1">
             <w:r>
               <w:rPr>
                 <w:rStyle w:val="Lienhypertexte"/>
@@ -2136,7 +2140,7 @@
                 <w:noProof/>
                 <w:webHidden/>
               </w:rPr>
-              <w:instrText xml:space="preserve"> PAGEREF _Toc240030435 \h </w:instrText>
+              <w:instrText xml:space="preserve"> PAGEREF _Toc240034954 \h </w:instrText>
             </w:r>
             <w:r>
               <w:rPr>
@@ -2179,7 +2183,7 @@
               <w:lang w:eastAsia="fr-CH"/>
             </w:rPr>
           </w:pPr>
-          <w:hyperlink w:anchor="_Toc240030436" w:history="1">
+          <w:hyperlink w:anchor="_Toc240034955" w:history="1">
             <w:r>
               <w:rPr>
                 <w:rStyle w:val="Lienhypertexte"/>
@@ -2210,7 +2214,7 @@
                 <w:noProof/>
                 <w:webHidden/>
               </w:rPr>
-              <w:instrText xml:space="preserve"> PAGEREF _Toc240030436 \h </w:instrText>
+              <w:instrText xml:space="preserve"> PAGEREF _Toc240034955 \h </w:instrText>
             </w:r>
             <w:r>
               <w:rPr>
@@ -2230,7 +2234,7 @@
                 <w:noProof/>
                 <w:webHidden/>
               </w:rPr>
-              <w:t>3</w:t>
+              <w:t>4</w:t>
             </w:r>
             <w:r>
               <w:rPr>
@@ -2253,7 +2257,7 @@
               <w:lang w:eastAsia="fr-CH"/>
             </w:rPr>
           </w:pPr>
-          <w:hyperlink w:anchor="_Toc240030437" w:history="1">
+          <w:hyperlink w:anchor="_Toc240034956" w:history="1">
             <w:r>
               <w:rPr>
                 <w:rStyle w:val="Lienhypertexte"/>
@@ -2284,7 +2288,7 @@
                 <w:noProof/>
                 <w:webHidden/>
               </w:rPr>
-              <w:instrText xml:space="preserve"> PAGEREF _Toc240030437 \h </w:instrText>
+              <w:instrText xml:space="preserve"> PAGEREF _Toc240034956 \h </w:instrText>
             </w:r>
             <w:r>
               <w:rPr>
@@ -2327,7 +2331,7 @@
               <w:lang w:eastAsia="fr-CH"/>
             </w:rPr>
           </w:pPr>
-          <w:hyperlink w:anchor="_Toc240030438" w:history="1">
+          <w:hyperlink w:anchor="_Toc240034957" w:history="1">
             <w:r>
               <w:rPr>
                 <w:rStyle w:val="Lienhypertexte"/>
@@ -2358,7 +2362,7 @@
                 <w:noProof/>
                 <w:webHidden/>
               </w:rPr>
-              <w:instrText xml:space="preserve"> PAGEREF _Toc240030438 \h </w:instrText>
+              <w:instrText xml:space="preserve"> PAGEREF _Toc240034957 \h </w:instrText>
             </w:r>
             <w:r>
               <w:rPr>
@@ -2378,7 +2382,7 @@
                 <w:noProof/>
                 <w:webHidden/>
               </w:rPr>
-              <w:t>4</w:t>
+              <w:t>5</w:t>
             </w:r>
             <w:r>
               <w:rPr>
@@ -2401,7 +2405,7 @@
               <w:lang w:eastAsia="fr-CH"/>
             </w:rPr>
           </w:pPr>
-          <w:hyperlink w:anchor="_Toc240030439" w:history="1">
+          <w:hyperlink w:anchor="_Toc240034958" w:history="1">
             <w:r>
               <w:rPr>
                 <w:rStyle w:val="Lienhypertexte"/>
@@ -2431,7 +2435,7 @@
                 <w:noProof/>
                 <w:webHidden/>
               </w:rPr>
-              <w:instrText xml:space="preserve"> PAGEREF _Toc240030439 \h </w:instrText>
+              <w:instrText xml:space="preserve"> PAGEREF _Toc240034958 \h </w:instrText>
             </w:r>
             <w:r>
               <w:rPr>
@@ -2451,7 +2455,7 @@
                 <w:noProof/>
                 <w:webHidden/>
               </w:rPr>
-              <w:t>5</w:t>
+              <w:t>6</w:t>
             </w:r>
             <w:r>
               <w:rPr>
@@ -2474,7 +2478,7 @@
               <w:lang w:eastAsia="fr-CH"/>
             </w:rPr>
           </w:pPr>
-          <w:hyperlink w:anchor="_Toc240030440" w:history="1">
+          <w:hyperlink w:anchor="_Toc240034959" w:history="1">
             <w:r>
               <w:rPr>
                 <w:rStyle w:val="Lienhypertexte"/>
@@ -2504,7 +2508,7 @@
                 <w:noProof/>
                 <w:webHidden/>
               </w:rPr>
-              <w:instrText xml:space="preserve"> PAGEREF _Toc240030440 \h </w:instrText>
+              <w:instrText xml:space="preserve"> PAGEREF _Toc240034959 \h </w:instrText>
             </w:r>
             <w:r>
               <w:rPr>
@@ -2524,7 +2528,7 @@
                 <w:noProof/>
                 <w:webHidden/>
               </w:rPr>
-              <w:t>6</w:t>
+              <w:t>7</w:t>
             </w:r>
             <w:r>
               <w:rPr>
@@ -2547,7 +2551,7 @@
               <w:lang w:eastAsia="fr-CH"/>
             </w:rPr>
           </w:pPr>
-          <w:hyperlink w:anchor="_Toc240030441" w:history="1">
+          <w:hyperlink w:anchor="_Toc240034960" w:history="1">
             <w:r>
               <w:rPr>
                 <w:rStyle w:val="Lienhypertexte"/>
@@ -2577,7 +2581,7 @@
                 <w:noProof/>
                 <w:webHidden/>
               </w:rPr>
-              <w:instrText xml:space="preserve"> PAGEREF _Toc240030441 \h </w:instrText>
+              <w:instrText xml:space="preserve"> PAGEREF _Toc240034960 \h </w:instrText>
             </w:r>
             <w:r>
               <w:rPr>
@@ -2597,7 +2601,7 @@
                 <w:noProof/>
                 <w:webHidden/>
               </w:rPr>
-              <w:t>6</w:t>
+              <w:t>7</w:t>
             </w:r>
             <w:r>
               <w:rPr>
@@ -2618,7 +2622,7 @@
               <w:lang w:eastAsia="fr-CH"/>
             </w:rPr>
           </w:pPr>
-          <w:hyperlink w:anchor="_Toc240030442" w:history="1">
+          <w:hyperlink w:anchor="_Toc240034961" w:history="1">
             <w:r>
               <w:rPr>
                 <w:rStyle w:val="Lienhypertexte"/>
@@ -2642,7 +2646,7 @@
               <w:rPr>
                 <w:webHidden/>
               </w:rPr>
-              <w:instrText xml:space="preserve"> PAGEREF _Toc240030442 \h </w:instrText>
+              <w:instrText xml:space="preserve"> PAGEREF _Toc240034961 \h </w:instrText>
             </w:r>
             <w:r>
               <w:rPr>
@@ -2659,7 +2663,7 @@
               <w:rPr>
                 <w:webHidden/>
               </w:rPr>
-              <w:t>7</w:t>
+              <w:t>8</w:t>
             </w:r>
             <w:r>
               <w:rPr>
@@ -2679,7 +2683,7 @@
               <w:lang w:eastAsia="fr-CH"/>
             </w:rPr>
           </w:pPr>
-          <w:hyperlink w:anchor="_Toc240030443" w:history="1">
+          <w:hyperlink w:anchor="_Toc240034962" w:history="1">
             <w:r>
               <w:rPr>
                 <w:rStyle w:val="Lienhypertexte"/>
@@ -2703,7 +2707,7 @@
               <w:rPr>
                 <w:webHidden/>
               </w:rPr>
-              <w:instrText xml:space="preserve"> PAGEREF _Toc240030443 \h </w:instrText>
+              <w:instrText xml:space="preserve"> PAGEREF _Toc240034962 \h </w:instrText>
             </w:r>
             <w:r>
               <w:rPr>
@@ -2720,7 +2724,7 @@
               <w:rPr>
                 <w:webHidden/>
               </w:rPr>
-              <w:t>7</w:t>
+              <w:t>9</w:t>
             </w:r>
             <w:r>
               <w:rPr>
@@ -2740,7 +2744,7 @@
               <w:lang w:eastAsia="fr-CH"/>
             </w:rPr>
           </w:pPr>
-          <w:hyperlink w:anchor="_Toc240030444" w:history="1">
+          <w:hyperlink w:anchor="_Toc240034963" w:history="1">
             <w:r>
               <w:rPr>
                 <w:rStyle w:val="Lienhypertexte"/>
@@ -2764,7 +2768,7 @@
               <w:rPr>
                 <w:webHidden/>
               </w:rPr>
-              <w:instrText xml:space="preserve"> PAGEREF _Toc240030444 \h </w:instrText>
+              <w:instrText xml:space="preserve"> PAGEREF _Toc240034963 \h </w:instrText>
             </w:r>
             <w:r>
               <w:rPr>
@@ -2781,7 +2785,7 @@
               <w:rPr>
                 <w:webHidden/>
               </w:rPr>
-              <w:t>7</w:t>
+              <w:t>9</w:t>
             </w:r>
             <w:r>
               <w:rPr>
@@ -2803,7 +2807,7 @@
               <w:lang w:eastAsia="fr-CH"/>
             </w:rPr>
           </w:pPr>
-          <w:hyperlink w:anchor="_Toc240030445" w:history="1">
+          <w:hyperlink w:anchor="_Toc240034964" w:history="1">
             <w:r>
               <w:rPr>
                 <w:rStyle w:val="Lienhypertexte"/>
@@ -2833,7 +2837,7 @@
                 <w:noProof/>
                 <w:webHidden/>
               </w:rPr>
-              <w:instrText xml:space="preserve"> PAGEREF _Toc240030445 \h </w:instrText>
+              <w:instrText xml:space="preserve"> PAGEREF _Toc240034964 \h </w:instrText>
             </w:r>
             <w:r>
               <w:rPr>
@@ -2853,7 +2857,7 @@
                 <w:noProof/>
                 <w:webHidden/>
               </w:rPr>
-              <w:t>7</w:t>
+              <w:t>9</w:t>
             </w:r>
             <w:r>
               <w:rPr>
@@ -2876,7 +2880,7 @@
               <w:lang w:eastAsia="fr-CH"/>
             </w:rPr>
           </w:pPr>
-          <w:hyperlink w:anchor="_Toc240030446" w:history="1">
+          <w:hyperlink w:anchor="_Toc240034965" w:history="1">
             <w:r>
               <w:rPr>
                 <w:rStyle w:val="Lienhypertexte"/>
@@ -2906,7 +2910,7 @@
                 <w:noProof/>
                 <w:webHidden/>
               </w:rPr>
-              <w:instrText xml:space="preserve"> PAGEREF _Toc240030446 \h </w:instrText>
+              <w:instrText xml:space="preserve"> PAGEREF _Toc240034965 \h </w:instrText>
             </w:r>
             <w:r>
               <w:rPr>
@@ -2926,7 +2930,7 @@
                 <w:noProof/>
                 <w:webHidden/>
               </w:rPr>
-              <w:t>7</w:t>
+              <w:t>9</w:t>
             </w:r>
             <w:r>
               <w:rPr>
@@ -2947,7 +2951,7 @@
               <w:lang w:eastAsia="fr-CH"/>
             </w:rPr>
           </w:pPr>
-          <w:hyperlink w:anchor="_Toc240030447" w:history="1">
+          <w:hyperlink w:anchor="_Toc240034966" w:history="1">
             <w:r>
               <w:rPr>
                 <w:rStyle w:val="Lienhypertexte"/>
@@ -2971,7 +2975,7 @@
               <w:rPr>
                 <w:webHidden/>
               </w:rPr>
-              <w:instrText xml:space="preserve"> PAGEREF _Toc240030447 \h </w:instrText>
+              <w:instrText xml:space="preserve"> PAGEREF _Toc240034966 \h </w:instrText>
             </w:r>
             <w:r>
               <w:rPr>
@@ -2988,7 +2992,7 @@
               <w:rPr>
                 <w:webHidden/>
               </w:rPr>
-              <w:t>7</w:t>
+              <w:t>9</w:t>
             </w:r>
             <w:r>
               <w:rPr>
@@ -3008,7 +3012,7 @@
               <w:lang w:eastAsia="fr-CH"/>
             </w:rPr>
           </w:pPr>
-          <w:hyperlink w:anchor="_Toc240030448" w:history="1">
+          <w:hyperlink w:anchor="_Toc240034967" w:history="1">
             <w:r>
               <w:rPr>
                 <w:rStyle w:val="Lienhypertexte"/>
@@ -3032,7 +3036,7 @@
               <w:rPr>
                 <w:webHidden/>
               </w:rPr>
-              <w:instrText xml:space="preserve"> PAGEREF _Toc240030448 \h </w:instrText>
+              <w:instrText xml:space="preserve"> PAGEREF _Toc240034967 \h </w:instrText>
             </w:r>
             <w:r>
               <w:rPr>
@@ -3049,7 +3053,7 @@
               <w:rPr>
                 <w:webHidden/>
               </w:rPr>
-              <w:t>7</w:t>
+              <w:t>9</w:t>
             </w:r>
             <w:r>
               <w:rPr>
@@ -3185,7 +3189,7 @@
           <w:bCs/>
         </w:rPr>
       </w:pPr>
-      <w:bookmarkStart w:id="0" w:name="_Toc240030430"/>
+      <w:bookmarkStart w:id="0" w:name="_Toc240034949"/>
       <w:r>
         <w:rPr>
           <w:rFonts w:ascii="Calibri" w:hAnsi="Calibri" w:cs="Calibri"/>
@@ -3224,7 +3228,7 @@
           <w:szCs w:val="36"/>
         </w:rPr>
       </w:pPr>
-      <w:bookmarkStart w:id="1" w:name="_Toc240030431"/>
+      <w:bookmarkStart w:id="1" w:name="_Toc240034950"/>
       <w:r>
         <w:rPr>
           <w:rFonts w:ascii="Calibri" w:hAnsi="Calibri" w:cs="Calibri"/>
@@ -3250,6 +3254,7 @@
     <w:p>
       <w:pPr>
         <w:ind w:left="284"/>
+        <w:jc w:val="both"/>
         <w:rPr>
           <w:rFonts w:ascii="Calibri" w:hAnsi="Calibri" w:cs="Calibri"/>
         </w:rPr>
@@ -3270,19 +3275,13 @@
         <w:rPr>
           <w:rFonts w:ascii="Calibri" w:hAnsi="Calibri" w:cs="Calibri"/>
         </w:rPr>
-        <w:t xml:space="preserve"> de ce projet est de concevoir et réaliser un jeu en 2D modulaire de tir à la troisième personne en C</w:t>
-      </w:r>
-      <w:r>
-        <w:rPr>
-          <w:rFonts w:ascii="Calibri" w:hAnsi="Calibri" w:cs="Calibri"/>
-        </w:rPr>
-        <w:t>#</w:t>
-      </w:r>
-      <w:r>
-        <w:rPr>
-          <w:rFonts w:ascii="Calibri" w:hAnsi="Calibri" w:cs="Calibri"/>
-        </w:rPr>
-        <w:t xml:space="preserve"> (Windows Forms).</w:t>
+        <w:t xml:space="preserve"> de ce projet est de concevoir et réaliser un jeu en 2D modulaire de tir à la troisième personne en C# (Windows Forms)</w:t>
+      </w:r>
+      <w:r>
+        <w:rPr>
+          <w:rFonts w:ascii="Calibri" w:hAnsi="Calibri" w:cs="Calibri"/>
+        </w:rPr>
+        <w:t xml:space="preserve"> et également géré le projet sur GitHub avec du versioning et des user storys.</w:t>
       </w:r>
     </w:p>
     <w:p>
@@ -3297,7 +3296,7 @@
           <w:szCs w:val="36"/>
         </w:rPr>
       </w:pPr>
-      <w:bookmarkStart w:id="2" w:name="_Toc240030432"/>
+      <w:bookmarkStart w:id="2" w:name="_Toc240034951"/>
       <w:r>
         <w:rPr>
           <w:rFonts w:ascii="Calibri" w:hAnsi="Calibri" w:cs="Calibri"/>
@@ -3353,27 +3352,34 @@
     <w:p>
       <w:pPr>
         <w:ind w:left="284"/>
-        <w:rPr>
-          <w:rFonts w:ascii="Calibri" w:hAnsi="Calibri" w:cs="Calibri"/>
-        </w:rPr>
-      </w:pPr>
-      <w:r>
-        <w:rPr>
-          <w:rFonts w:ascii="Calibri" w:hAnsi="Calibri" w:cs="Calibri"/>
-        </w:rPr>
-        <w:t>L’objectifs pédagogique de ce projet est d’apprendre la programmation orienté objet en C</w:t>
-      </w:r>
-      <w:r>
-        <w:rPr>
-          <w:rFonts w:ascii="Calibri" w:hAnsi="Calibri" w:cs="Calibri"/>
-        </w:rPr>
-        <w:t>#</w:t>
-      </w:r>
-      <w:r>
-        <w:rPr>
-          <w:rFonts w:ascii="Calibri" w:hAnsi="Calibri" w:cs="Calibri"/>
-        </w:rPr>
-        <w:t xml:space="preserve"> et d’apprendre à utiliser Windows Forms.</w:t>
+        <w:jc w:val="both"/>
+        <w:rPr>
+          <w:rFonts w:ascii="Calibri" w:hAnsi="Calibri" w:cs="Calibri"/>
+        </w:rPr>
+      </w:pPr>
+      <w:r>
+        <w:rPr>
+          <w:rFonts w:ascii="Calibri" w:hAnsi="Calibri" w:cs="Calibri"/>
+        </w:rPr>
+        <w:t>L’objectifs pédagogique de ce projet est d’apprendre la programmation orienté objet en C#</w:t>
+      </w:r>
+      <w:r>
+        <w:rPr>
+          <w:rFonts w:ascii="Calibri" w:hAnsi="Calibri" w:cs="Calibri"/>
+        </w:rPr>
+        <w:t xml:space="preserve">, </w:t>
+      </w:r>
+      <w:r>
+        <w:rPr>
+          <w:rFonts w:ascii="Calibri" w:hAnsi="Calibri" w:cs="Calibri"/>
+        </w:rPr>
+        <w:t>d’apprendre à utiliser Windows Form</w:t>
+      </w:r>
+      <w:r>
+        <w:rPr>
+          <w:rFonts w:ascii="Calibri" w:hAnsi="Calibri" w:cs="Calibri"/>
+        </w:rPr>
+        <w:t xml:space="preserve">s, d’améliorer ses capacités de gestion de projet, apprendre à utiliser GitHub pour gérer un projet, mettre en pratique l’utilisation et la planification d’user storys, améliorer ses compétences sur l’expérience utilisateur et l’interface utilisateur. </w:t>
       </w:r>
     </w:p>
     <w:p>
@@ -3386,7 +3392,7 @@
           <w:bCs/>
         </w:rPr>
       </w:pPr>
-      <w:bookmarkStart w:id="3" w:name="_Toc240030433"/>
+      <w:bookmarkStart w:id="3" w:name="_Toc240034952"/>
       <w:r>
         <w:rPr>
           <w:rFonts w:ascii="Calibri" w:hAnsi="Calibri" w:cs="Calibri"/>
@@ -3417,7 +3423,7 @@
           <w:szCs w:val="36"/>
         </w:rPr>
       </w:pPr>
-      <w:bookmarkStart w:id="4" w:name="_Toc240030434"/>
+      <w:bookmarkStart w:id="4" w:name="_Toc240034953"/>
       <w:r>
         <w:rPr>
           <w:rFonts w:ascii="Calibri" w:hAnsi="Calibri" w:cs="Calibri"/>
@@ -3474,7 +3480,7 @@
     </w:p>
     <w:p>
       <w:pPr>
-        <w:ind w:left="284"/>
+        <w:ind w:left="142"/>
         <w:rPr>
           <w:b/>
           <w:bCs/>
@@ -3492,7 +3498,8 @@
     </w:p>
     <w:p>
       <w:pPr>
-        <w:ind w:left="284"/>
+        <w:ind w:left="142"/>
+        <w:jc w:val="both"/>
         <w:rPr>
           <w:rFonts w:ascii="Calibri" w:hAnsi="Calibri" w:cs="Calibri"/>
         </w:rPr>
@@ -3506,7 +3513,7 @@
     </w:p>
     <w:p>
       <w:pPr>
-        <w:ind w:left="284"/>
+        <w:ind w:left="142"/>
         <w:rPr>
           <w:b/>
           <w:bCs/>
@@ -3537,6 +3544,7 @@
           <w:ilvl w:val="0"/>
           <w:numId w:val="26"/>
         </w:numPr>
+        <w:jc w:val="both"/>
         <w:rPr>
           <w:rFonts w:ascii="Calibri" w:hAnsi="Calibri" w:cs="Calibri"/>
         </w:rPr>
@@ -3555,6 +3563,7 @@
           <w:ilvl w:val="0"/>
           <w:numId w:val="26"/>
         </w:numPr>
+        <w:jc w:val="both"/>
         <w:rPr>
           <w:rFonts w:ascii="Calibri" w:hAnsi="Calibri" w:cs="Calibri"/>
         </w:rPr>
@@ -3568,30 +3577,58 @@
     </w:p>
     <w:p>
       <w:pPr>
-        <w:ind w:left="284"/>
-        <w:rPr>
-          <w:b/>
-          <w:bCs/>
-          <w:u w:val="single"/>
-        </w:rPr>
-      </w:pPr>
-      <w:r>
-        <w:rPr>
-          <w:b/>
-          <w:bCs/>
-          <w:u w:val="single"/>
-        </w:rPr>
+        <w:pStyle w:val="Paragraphedeliste"/>
+        <w:numPr>
+          <w:ilvl w:val="0"/>
+          <w:numId w:val="26"/>
+        </w:numPr>
+        <w:jc w:val="both"/>
+        <w:rPr>
+          <w:rFonts w:ascii="Calibri" w:hAnsi="Calibri" w:cs="Calibri"/>
+        </w:rPr>
+      </w:pPr>
+      <w:r>
+        <w:rPr>
+          <w:rFonts w:ascii="Calibri" w:hAnsi="Calibri" w:cs="Calibri"/>
+        </w:rPr>
+        <w:t xml:space="preserve">Une fois le personnage arrivé sur une extrémité, le déplacement est stoppé et le personnage </w:t>
+      </w:r>
+      <w:r>
+        <w:rPr>
+          <w:rFonts w:ascii="Calibri" w:hAnsi="Calibri" w:cs="Calibri"/>
+        </w:rPr>
+        <w:t>se</w:t>
+      </w:r>
+      <w:r>
+        <w:rPr>
+          <w:rFonts w:ascii="Calibri" w:hAnsi="Calibri" w:cs="Calibri"/>
+        </w:rPr>
+        <w:t xml:space="preserve"> remet droit </w:t>
+      </w:r>
+    </w:p>
+    <w:p>
+      <w:pPr>
+        <w:ind w:left="142"/>
+        <w:rPr>
+          <w:rFonts w:ascii="Calibri" w:hAnsi="Calibri" w:cs="Calibri"/>
+        </w:rPr>
+      </w:pPr>
+      <w:r>
+        <w:rPr>
+          <w:noProof/>
+        </w:rPr>
+        <w:lastRenderedPageBreak/>
         <w:drawing>
-          <wp:anchor distT="0" distB="0" distL="114300" distR="114300" simplePos="0" relativeHeight="251666432" behindDoc="0" locked="0" layoutInCell="1" allowOverlap="1" wp14:anchorId="2F923007" wp14:editId="4C37DC78">
+          <wp:anchor distT="0" distB="0" distL="114300" distR="114300" simplePos="0" relativeHeight="251666432" behindDoc="0" locked="0" layoutInCell="1" allowOverlap="1" wp14:anchorId="2F923007" wp14:editId="29D47821">
             <wp:simplePos x="0" y="0"/>
             <wp:positionH relativeFrom="margin">
-              <wp:align>center</wp:align>
+              <wp:posOffset>1696913</wp:posOffset>
             </wp:positionH>
             <wp:positionV relativeFrom="paragraph">
-              <wp:posOffset>495300</wp:posOffset>
+              <wp:posOffset>360542</wp:posOffset>
             </wp:positionV>
-            <wp:extent cx="2583815" cy="2624455"/>
-            <wp:effectExtent l="76200" t="38100" r="83185" b="118745"/>
+            <wp:extent cx="2213610" cy="2248535"/>
+            <wp:effectExtent l="76200" t="38100" r="72390" b="113665"/>
             <wp:wrapTopAndBottom/>
             <wp:docPr id="396705010" name="Image 1"/>
             <wp:cNvGraphicFramePr>
@@ -3619,7 +3656,7 @@
                   <pic:spPr>
                     <a:xfrm>
                       <a:off x="0" y="0"/>
-                      <a:ext cx="2583815" cy="2624455"/>
+                      <a:ext cx="2213610" cy="2248535"/>
                     </a:xfrm>
                     <a:prstGeom prst="rect">
                       <a:avLst/>
@@ -3683,7 +3720,7 @@
           <w:szCs w:val="36"/>
         </w:rPr>
       </w:pPr>
-      <w:bookmarkStart w:id="5" w:name="_Toc240030435"/>
+      <w:bookmarkStart w:id="5" w:name="_Toc240034954"/>
       <w:r>
         <w:rPr>
           <w:rFonts w:ascii="Calibri" w:hAnsi="Calibri" w:cs="Calibri"/>
@@ -3730,7 +3767,7 @@
     </w:p>
     <w:p>
       <w:pPr>
-        <w:ind w:left="284"/>
+        <w:ind w:left="142"/>
         <w:rPr>
           <w:b/>
           <w:bCs/>
@@ -3748,33 +3785,22 @@
     </w:p>
     <w:p>
       <w:pPr>
-        <w:ind w:left="284"/>
-        <w:rPr>
-          <w:rFonts w:ascii="Calibri" w:hAnsi="Calibri" w:cs="Calibri"/>
-        </w:rPr>
-      </w:pPr>
-      <w:r>
-        <w:rPr>
-          <w:rFonts w:ascii="Calibri" w:hAnsi="Calibri" w:cs="Calibri"/>
-        </w:rPr>
-        <w:t xml:space="preserve">En tant que joueur, je veux pouvoir tirer sur mes ennemis, afin d'avoir de l'action dans </w:t>
-      </w:r>
-      <w:r>
-        <w:rPr>
-          <w:rFonts w:ascii="Calibri" w:hAnsi="Calibri" w:cs="Calibri"/>
-        </w:rPr>
-        <w:t>le jeu</w:t>
-      </w:r>
-      <w:r>
-        <w:rPr>
-          <w:rFonts w:ascii="Calibri" w:hAnsi="Calibri" w:cs="Calibri"/>
-        </w:rPr>
-        <w:t xml:space="preserve"> et pouvoir vaincre mes ennemis pour gagner.</w:t>
+        <w:ind w:left="142"/>
+        <w:jc w:val="both"/>
+        <w:rPr>
+          <w:rFonts w:ascii="Calibri" w:hAnsi="Calibri" w:cs="Calibri"/>
+        </w:rPr>
+      </w:pPr>
+      <w:r>
+        <w:rPr>
+          <w:rFonts w:ascii="Calibri" w:hAnsi="Calibri" w:cs="Calibri"/>
+        </w:rPr>
+        <w:t>En tant que joueur, je veux pouvoir tirer sur mes ennemis, afin d'avoir de l'action dans le jeu et pouvoir vaincre mes ennemis pour gagner.</w:t>
       </w:r>
     </w:p>
     <w:p>
       <w:pPr>
-        <w:ind w:left="284"/>
+        <w:ind w:left="142"/>
         <w:rPr>
           <w:b/>
           <w:bCs/>
@@ -3805,6 +3831,7 @@
           <w:ilvl w:val="0"/>
           <w:numId w:val="26"/>
         </w:numPr>
+        <w:jc w:val="both"/>
         <w:rPr>
           <w:rFonts w:ascii="Calibri" w:hAnsi="Calibri" w:cs="Calibri"/>
         </w:rPr>
@@ -3818,6 +3845,7 @@
       <w:r>
         <w:rPr>
           <w:rFonts w:ascii="Calibri" w:hAnsi="Calibri" w:cs="Calibri"/>
+          <w:noProof/>
         </w:rPr>
         <w:drawing>
           <wp:inline distT="0" distB="0" distL="0" distR="0" wp14:anchorId="5A51A990" wp14:editId="3B6C7E58">
@@ -3881,6 +3909,7 @@
       <w:r>
         <w:rPr>
           <w:rFonts w:ascii="Calibri" w:hAnsi="Calibri" w:cs="Calibri"/>
+          <w:noProof/>
         </w:rPr>
         <w:drawing>
           <wp:inline distT="0" distB="0" distL="0" distR="0" wp14:anchorId="09E2D28E" wp14:editId="24786FFA">
@@ -3949,39 +3978,28 @@
           <w:ilvl w:val="0"/>
           <w:numId w:val="26"/>
         </w:numPr>
-        <w:rPr>
-          <w:rFonts w:ascii="Calibri" w:hAnsi="Calibri" w:cs="Calibri"/>
-        </w:rPr>
-      </w:pPr>
-      <w:r>
-        <w:rPr>
-          <w:rFonts w:ascii="Calibri" w:hAnsi="Calibri" w:cs="Calibri"/>
-        </w:rPr>
-        <w:t xml:space="preserve">Quand je </w:t>
-      </w:r>
-      <w:r>
-        <w:rPr>
-          <w:rFonts w:ascii="Calibri" w:hAnsi="Calibri" w:cs="Calibri"/>
-        </w:rPr>
-        <w:t>tire</w:t>
-      </w:r>
-      <w:r>
-        <w:rPr>
-          <w:rFonts w:ascii="Calibri" w:hAnsi="Calibri" w:cs="Calibri"/>
-        </w:rPr>
-        <w:t xml:space="preserve"> une </w:t>
-      </w:r>
-      <w:r>
-        <w:rPr>
-          <w:rFonts w:ascii="Calibri" w:hAnsi="Calibri" w:cs="Calibri"/>
-        </w:rPr>
-        <w:t>boule</w:t>
-      </w:r>
-      <w:r>
-        <w:rPr>
-          <w:rFonts w:ascii="Calibri" w:hAnsi="Calibri" w:cs="Calibri"/>
-        </w:rPr>
-        <w:t xml:space="preserve"> de neige pars tout droit depuis le personnage</w:t>
+        <w:jc w:val="both"/>
+        <w:rPr>
+          <w:rFonts w:ascii="Calibri" w:hAnsi="Calibri" w:cs="Calibri"/>
+        </w:rPr>
+      </w:pPr>
+      <w:r>
+        <w:rPr>
+          <w:rFonts w:ascii="Calibri" w:hAnsi="Calibri" w:cs="Calibri"/>
+        </w:rPr>
+        <w:t>Quand je tire</w:t>
+      </w:r>
+      <w:r>
+        <w:rPr>
+          <w:rFonts w:ascii="Calibri" w:hAnsi="Calibri" w:cs="Calibri"/>
+        </w:rPr>
+        <w:t>,</w:t>
+      </w:r>
+      <w:r>
+        <w:rPr>
+          <w:rFonts w:ascii="Calibri" w:hAnsi="Calibri" w:cs="Calibri"/>
+        </w:rPr>
+        <w:t xml:space="preserve"> une boule de neige pars tout droit depuis le personnage</w:t>
       </w:r>
     </w:p>
     <w:p>
@@ -3991,27 +4009,16 @@
           <w:ilvl w:val="0"/>
           <w:numId w:val="26"/>
         </w:numPr>
-        <w:rPr>
-          <w:rFonts w:ascii="Calibri" w:hAnsi="Calibri" w:cs="Calibri"/>
-        </w:rPr>
-      </w:pPr>
-      <w:r>
-        <w:rPr>
-          <w:rFonts w:ascii="Calibri" w:hAnsi="Calibri" w:cs="Calibri"/>
-        </w:rPr>
-        <w:t xml:space="preserve">Après </w:t>
-      </w:r>
-      <w:r>
-        <w:rPr>
-          <w:rFonts w:ascii="Calibri" w:hAnsi="Calibri" w:cs="Calibri"/>
-        </w:rPr>
-        <w:t>un tir</w:t>
-      </w:r>
-      <w:r>
-        <w:rPr>
-          <w:rFonts w:ascii="Calibri" w:hAnsi="Calibri" w:cs="Calibri"/>
-        </w:rPr>
-        <w:t xml:space="preserve"> il y a un couldown de 1 seconde</w:t>
+        <w:jc w:val="both"/>
+        <w:rPr>
+          <w:rFonts w:ascii="Calibri" w:hAnsi="Calibri" w:cs="Calibri"/>
+        </w:rPr>
+      </w:pPr>
+      <w:r>
+        <w:rPr>
+          <w:rFonts w:ascii="Calibri" w:hAnsi="Calibri" w:cs="Calibri"/>
+        </w:rPr>
+        <w:t>Après un tir il y a un couldown de 1 seconde</w:t>
       </w:r>
     </w:p>
     <w:p>
@@ -4021,49 +4028,30 @@
           <w:ilvl w:val="0"/>
           <w:numId w:val="26"/>
         </w:numPr>
-        <w:rPr>
-          <w:rFonts w:ascii="Calibri" w:hAnsi="Calibri" w:cs="Calibri"/>
-        </w:rPr>
-      </w:pPr>
-      <w:r>
-        <w:rPr>
-          <w:rFonts w:ascii="Calibri" w:hAnsi="Calibri" w:cs="Calibri"/>
-        </w:rPr>
-        <w:t xml:space="preserve">Quand une </w:t>
-      </w:r>
-      <w:r>
-        <w:rPr>
-          <w:rFonts w:ascii="Calibri" w:hAnsi="Calibri" w:cs="Calibri"/>
-        </w:rPr>
-        <w:t>boule</w:t>
-      </w:r>
-      <w:r>
-        <w:rPr>
-          <w:rFonts w:ascii="Calibri" w:hAnsi="Calibri" w:cs="Calibri"/>
-        </w:rPr>
-        <w:t xml:space="preserve"> de neige touche une protection de glace, elle subit aucun dégât mais la </w:t>
-      </w:r>
-      <w:r>
-        <w:rPr>
-          <w:rFonts w:ascii="Calibri" w:hAnsi="Calibri" w:cs="Calibri"/>
-        </w:rPr>
-        <w:t>boule</w:t>
-      </w:r>
-      <w:r>
-        <w:rPr>
-          <w:rFonts w:ascii="Calibri" w:hAnsi="Calibri" w:cs="Calibri"/>
-        </w:rPr>
-        <w:t xml:space="preserve"> de neige se casse et ne va pas plus loin</w:t>
+        <w:jc w:val="both"/>
+        <w:rPr>
+          <w:rFonts w:ascii="Calibri" w:hAnsi="Calibri" w:cs="Calibri"/>
+        </w:rPr>
+      </w:pPr>
+      <w:r>
+        <w:rPr>
+          <w:rFonts w:ascii="Calibri" w:hAnsi="Calibri" w:cs="Calibri"/>
+        </w:rPr>
+        <w:t>Quand une boule de neige touche une protection de glace, elle subit aucun dégât mais la boule de neige se casse et ne va pas plus loin</w:t>
       </w:r>
     </w:p>
     <w:p>
       <w:pPr>
-        <w:ind w:left="284"/>
+        <w:ind w:left="142"/>
+        <w:rPr>
+          <w:lang w:val="en-US"/>
+        </w:rPr>
       </w:pPr>
       <w:r>
         <w:rPr>
           <w:noProof/>
         </w:rPr>
+        <w:lastRenderedPageBreak/>
         <mc:AlternateContent>
           <mc:Choice Requires="wps">
             <w:drawing>
@@ -4158,6 +4146,7 @@
         <w:rPr>
           <w:b/>
           <w:bCs/>
+          <w:noProof/>
           <w:u w:val="single"/>
         </w:rPr>
         <w:drawing>
@@ -4329,6 +4318,7 @@
         <w:rPr>
           <w:b/>
           <w:bCs/>
+          <w:noProof/>
           <w:u w:val="single"/>
         </w:rPr>
         <w:drawing>
@@ -4407,6 +4397,7 @@
           <w:b/>
           <w:bCs/>
           <w:u w:val="single"/>
+          <w:lang w:val="en-US"/>
         </w:rPr>
         <w:t>Maquette :</w:t>
       </w:r>
@@ -4420,23 +4411,10 @@
           <w:color w:val="0F4761" w:themeColor="accent1" w:themeShade="BF"/>
           <w:sz w:val="36"/>
           <w:szCs w:val="36"/>
-        </w:rPr>
-      </w:pPr>
-      <w:r>
-        <w:rPr>
-          <w:rFonts w:ascii="Calibri" w:hAnsi="Calibri" w:cs="Calibri"/>
-          <w:b/>
-          <w:bCs/>
-          <w:sz w:val="36"/>
-          <w:szCs w:val="36"/>
-        </w:rPr>
-        <w:br w:type="page"/>
-      </w:r>
-    </w:p>
-    <w:p>
-      <w:pPr>
-        <w:pStyle w:val="Titre2"/>
-        <w:ind w:left="142"/>
+          <w:lang w:val="en-US"/>
+        </w:rPr>
+      </w:pPr>
+      <w:r>
         <w:rPr>
           <w:rFonts w:ascii="Calibri" w:hAnsi="Calibri" w:cs="Calibri"/>
           <w:b/>
@@ -4445,9 +4423,13 @@
           <w:szCs w:val="36"/>
           <w:lang w:val="en-US"/>
         </w:rPr>
-      </w:pPr>
-      <w:bookmarkStart w:id="6" w:name="_Toc240030436"/>
-      <w:r>
+        <w:br w:type="page"/>
+      </w:r>
+    </w:p>
+    <w:p>
+      <w:pPr>
+        <w:pStyle w:val="Titre2"/>
+        <w:ind w:left="142"/>
         <w:rPr>
           <w:rFonts w:ascii="Calibri" w:hAnsi="Calibri" w:cs="Calibri"/>
           <w:b/>
@@ -4456,6 +4438,17 @@
           <w:szCs w:val="36"/>
           <w:lang w:val="en-US"/>
         </w:rPr>
+      </w:pPr>
+      <w:bookmarkStart w:id="6" w:name="_Toc240034955"/>
+      <w:r>
+        <w:rPr>
+          <w:rFonts w:ascii="Calibri" w:hAnsi="Calibri" w:cs="Calibri"/>
+          <w:b/>
+          <w:bCs/>
+          <w:sz w:val="36"/>
+          <w:szCs w:val="36"/>
+          <w:lang w:val="en-US"/>
+        </w:rPr>
         <w:lastRenderedPageBreak/>
         <w:t>2.3 US 3: Enemies</w:t>
       </w:r>
@@ -4468,6 +4461,7 @@
           <w:b/>
           <w:bCs/>
           <w:u w:val="single"/>
+          <w:lang w:val="en-US"/>
         </w:rPr>
       </w:pPr>
       <w:r>
@@ -4475,6 +4469,7 @@
           <w:b/>
           <w:bCs/>
           <w:u w:val="single"/>
+          <w:lang w:val="en-US"/>
         </w:rPr>
         <w:t>User Story :</w:t>
       </w:r>
@@ -4482,27 +4477,16 @@
     <w:p>
       <w:pPr>
         <w:ind w:left="284"/>
-        <w:rPr>
-          <w:rFonts w:ascii="Calibri" w:hAnsi="Calibri" w:cs="Calibri"/>
-        </w:rPr>
-      </w:pPr>
-      <w:r>
-        <w:rPr>
-          <w:rFonts w:ascii="Calibri" w:hAnsi="Calibri" w:cs="Calibri"/>
-        </w:rPr>
-        <w:t xml:space="preserve">En tant que joueur, je veux pouvoir avoir différents ennemis, afin d'avoir de l'action dans </w:t>
-      </w:r>
-      <w:r>
-        <w:rPr>
-          <w:rFonts w:ascii="Calibri" w:hAnsi="Calibri" w:cs="Calibri"/>
-        </w:rPr>
-        <w:t>le jeu</w:t>
-      </w:r>
-      <w:r>
-        <w:rPr>
-          <w:rFonts w:ascii="Calibri" w:hAnsi="Calibri" w:cs="Calibri"/>
-        </w:rPr>
-        <w:t>, de la variété et un but.</w:t>
+        <w:jc w:val="both"/>
+        <w:rPr>
+          <w:rFonts w:ascii="Calibri" w:hAnsi="Calibri" w:cs="Calibri"/>
+        </w:rPr>
+      </w:pPr>
+      <w:r>
+        <w:rPr>
+          <w:rFonts w:ascii="Calibri" w:hAnsi="Calibri" w:cs="Calibri"/>
+        </w:rPr>
+        <w:t>En tant que joueur, je veux pouvoir avoir différents ennemis, afin d'avoir de l'action dans le jeu, de la variété et un but.</w:t>
       </w:r>
     </w:p>
     <w:p>
@@ -4538,15 +4522,40 @@
           <w:ilvl w:val="0"/>
           <w:numId w:val="26"/>
         </w:numPr>
-        <w:rPr>
-          <w:rFonts w:ascii="Calibri" w:hAnsi="Calibri" w:cs="Calibri"/>
-        </w:rPr>
-      </w:pPr>
-      <w:r>
-        <w:rPr>
-          <w:rFonts w:ascii="Calibri" w:hAnsi="Calibri" w:cs="Calibri"/>
-        </w:rPr>
-        <w:t>Je veux que 5 ennemis aléatoire apparaissent aléatoirement entre 3 axes de hauteurs et 4 axes de largeur</w:t>
+        <w:jc w:val="both"/>
+        <w:rPr>
+          <w:rFonts w:ascii="Calibri" w:hAnsi="Calibri" w:cs="Calibri"/>
+        </w:rPr>
+      </w:pPr>
+      <w:r>
+        <w:rPr>
+          <w:rFonts w:ascii="Calibri" w:hAnsi="Calibri" w:cs="Calibri"/>
+        </w:rPr>
+        <w:t xml:space="preserve">5 ennemis apparaissent aléatoirement entre 3 </w:t>
+      </w:r>
+      <w:r>
+        <w:rPr>
+          <w:rFonts w:ascii="Calibri" w:hAnsi="Calibri" w:cs="Calibri"/>
+        </w:rPr>
+        <w:t>niveaux</w:t>
+      </w:r>
+      <w:r>
+        <w:rPr>
+          <w:rFonts w:ascii="Calibri" w:hAnsi="Calibri" w:cs="Calibri"/>
+        </w:rPr>
+        <w:t xml:space="preserve"> de hauteurs et 4 </w:t>
+      </w:r>
+      <w:r>
+        <w:rPr>
+          <w:rFonts w:ascii="Calibri" w:hAnsi="Calibri" w:cs="Calibri"/>
+        </w:rPr>
+        <w:t>niveaux</w:t>
+      </w:r>
+      <w:r>
+        <w:rPr>
+          <w:rFonts w:ascii="Calibri" w:hAnsi="Calibri" w:cs="Calibri"/>
+        </w:rPr>
+        <w:t xml:space="preserve"> de largeur</w:t>
       </w:r>
     </w:p>
     <w:p>
@@ -4556,15 +4565,34 @@
           <w:ilvl w:val="0"/>
           <w:numId w:val="26"/>
         </w:numPr>
-        <w:rPr>
-          <w:rFonts w:ascii="Calibri" w:hAnsi="Calibri" w:cs="Calibri"/>
-        </w:rPr>
-      </w:pPr>
-      <w:r>
-        <w:rPr>
-          <w:rFonts w:ascii="Calibri" w:hAnsi="Calibri" w:cs="Calibri"/>
-        </w:rPr>
-        <w:t>Je veux que quand il reste 2 ennemis, 5 nouveaux ennemis aléatoire apparaissent aléatoirement parmi les axes disponibles</w:t>
+        <w:jc w:val="both"/>
+        <w:rPr>
+          <w:rFonts w:ascii="Calibri" w:hAnsi="Calibri" w:cs="Calibri"/>
+        </w:rPr>
+      </w:pPr>
+      <w:r>
+        <w:rPr>
+          <w:rFonts w:ascii="Calibri" w:hAnsi="Calibri" w:cs="Calibri"/>
+        </w:rPr>
+        <w:t>Q</w:t>
+      </w:r>
+      <w:r>
+        <w:rPr>
+          <w:rFonts w:ascii="Calibri" w:hAnsi="Calibri" w:cs="Calibri"/>
+        </w:rPr>
+        <w:t xml:space="preserve">uand il reste 2 ennemis, 5 nouveaux ennemis aléatoire apparaissent aléatoirement parmi les </w:t>
+      </w:r>
+      <w:r>
+        <w:rPr>
+          <w:rFonts w:ascii="Calibri" w:hAnsi="Calibri" w:cs="Calibri"/>
+        </w:rPr>
+        <w:t>axes</w:t>
+      </w:r>
+      <w:r>
+        <w:rPr>
+          <w:rFonts w:ascii="Calibri" w:hAnsi="Calibri" w:cs="Calibri"/>
+        </w:rPr>
+        <w:t xml:space="preserve"> disponibles</w:t>
       </w:r>
     </w:p>
     <w:p>
@@ -4574,15 +4602,40 @@
           <w:ilvl w:val="0"/>
           <w:numId w:val="26"/>
         </w:numPr>
-        <w:rPr>
-          <w:rFonts w:ascii="Calibri" w:hAnsi="Calibri" w:cs="Calibri"/>
-        </w:rPr>
-      </w:pPr>
-      <w:r>
-        <w:rPr>
-          <w:rFonts w:ascii="Calibri" w:hAnsi="Calibri" w:cs="Calibri"/>
-        </w:rPr>
-        <w:t>Je veux que le nombre maximum d'ennemis présent sur la carte soit 12</w:t>
+        <w:jc w:val="both"/>
+        <w:rPr>
+          <w:rFonts w:ascii="Calibri" w:hAnsi="Calibri" w:cs="Calibri"/>
+        </w:rPr>
+      </w:pPr>
+      <w:r>
+        <w:rPr>
+          <w:rFonts w:ascii="Calibri" w:hAnsi="Calibri" w:cs="Calibri"/>
+        </w:rPr>
+        <w:t>L</w:t>
+      </w:r>
+      <w:r>
+        <w:rPr>
+          <w:rFonts w:ascii="Calibri" w:hAnsi="Calibri" w:cs="Calibri"/>
+        </w:rPr>
+        <w:t xml:space="preserve">e nombre maximum d'ennemis présent sur la carte </w:t>
+      </w:r>
+      <w:r>
+        <w:rPr>
+          <w:rFonts w:ascii="Calibri" w:hAnsi="Calibri" w:cs="Calibri"/>
+        </w:rPr>
+        <w:t>est</w:t>
+      </w:r>
+      <w:r>
+        <w:rPr>
+          <w:rFonts w:ascii="Calibri" w:hAnsi="Calibri" w:cs="Calibri"/>
+        </w:rPr>
+        <w:t xml:space="preserve"> </w:t>
+      </w:r>
+      <w:r>
+        <w:rPr>
+          <w:rFonts w:ascii="Calibri" w:hAnsi="Calibri" w:cs="Calibri"/>
+        </w:rPr>
+        <w:t>7</w:t>
       </w:r>
     </w:p>
     <w:p>
@@ -4592,15 +4645,22 @@
           <w:ilvl w:val="0"/>
           <w:numId w:val="26"/>
         </w:numPr>
-        <w:rPr>
-          <w:rFonts w:ascii="Calibri" w:hAnsi="Calibri" w:cs="Calibri"/>
-        </w:rPr>
-      </w:pPr>
-      <w:r>
-        <w:rPr>
-          <w:rFonts w:ascii="Calibri" w:hAnsi="Calibri" w:cs="Calibri"/>
-        </w:rPr>
-        <w:t>Je veux que les ennemis tirs un projectile à la fois avec un couldown de 1 seconde et une animation</w:t>
+        <w:jc w:val="both"/>
+        <w:rPr>
+          <w:rFonts w:ascii="Calibri" w:hAnsi="Calibri" w:cs="Calibri"/>
+        </w:rPr>
+      </w:pPr>
+      <w:r>
+        <w:rPr>
+          <w:rFonts w:ascii="Calibri" w:hAnsi="Calibri" w:cs="Calibri"/>
+        </w:rPr>
+        <w:t>L</w:t>
+      </w:r>
+      <w:r>
+        <w:rPr>
+          <w:rFonts w:ascii="Calibri" w:hAnsi="Calibri" w:cs="Calibri"/>
+        </w:rPr>
+        <w:t>es ennemis tirs un projectile à la fois avec un couldown de 1 seconde et une animation</w:t>
       </w:r>
     </w:p>
     <w:p>
@@ -4610,27 +4670,16 @@
           <w:ilvl w:val="0"/>
           <w:numId w:val="26"/>
         </w:numPr>
-        <w:rPr>
-          <w:rFonts w:ascii="Calibri" w:hAnsi="Calibri" w:cs="Calibri"/>
-        </w:rPr>
-      </w:pPr>
-      <w:r>
-        <w:rPr>
-          <w:rFonts w:ascii="Calibri" w:hAnsi="Calibri" w:cs="Calibri"/>
-        </w:rPr>
-        <w:t xml:space="preserve">Quand un projectile touche une protection de glace, elle subit </w:t>
-      </w:r>
-      <w:r>
-        <w:rPr>
-          <w:rFonts w:ascii="Calibri" w:hAnsi="Calibri" w:cs="Calibri"/>
-        </w:rPr>
-        <w:t>des dégâts</w:t>
-      </w:r>
-      <w:r>
-        <w:rPr>
-          <w:rFonts w:ascii="Calibri" w:hAnsi="Calibri" w:cs="Calibri"/>
-        </w:rPr>
-        <w:t xml:space="preserve"> et le projectile se casse et ne va pas plus loin</w:t>
+        <w:jc w:val="both"/>
+        <w:rPr>
+          <w:rFonts w:ascii="Calibri" w:hAnsi="Calibri" w:cs="Calibri"/>
+        </w:rPr>
+      </w:pPr>
+      <w:r>
+        <w:rPr>
+          <w:rFonts w:ascii="Calibri" w:hAnsi="Calibri" w:cs="Calibri"/>
+        </w:rPr>
+        <w:t>Quand un projectile touche une protection de glace, elle subit des dégâts et le projectile se casse et ne va pas plus loin</w:t>
       </w:r>
     </w:p>
     <w:p>
@@ -4640,51 +4689,34 @@
           <w:ilvl w:val="0"/>
           <w:numId w:val="26"/>
         </w:numPr>
-        <w:rPr>
-          <w:rFonts w:ascii="Calibri" w:hAnsi="Calibri" w:cs="Calibri"/>
-        </w:rPr>
-      </w:pPr>
-      <w:r>
-        <w:rPr>
-          <w:rFonts w:ascii="Calibri" w:hAnsi="Calibri" w:cs="Calibri"/>
-        </w:rPr>
-        <w:t xml:space="preserve">Je veux que les ennemis </w:t>
-      </w:r>
-      <w:r>
-        <w:rPr>
-          <w:rFonts w:ascii="Calibri" w:hAnsi="Calibri" w:cs="Calibri"/>
-        </w:rPr>
-        <w:t>puissent</w:t>
-      </w:r>
-      <w:r>
-        <w:rPr>
-          <w:rFonts w:ascii="Calibri" w:hAnsi="Calibri" w:cs="Calibri"/>
-        </w:rPr>
-        <w:t xml:space="preserve"> se déplacer d'une case à une case et seulement sur les axes de droite, de gauche, du haut et du bas sur </w:t>
-      </w:r>
-      <w:r>
-        <w:rPr>
-          <w:rFonts w:ascii="Calibri" w:hAnsi="Calibri" w:cs="Calibri"/>
-        </w:rPr>
-        <w:t>lesquels</w:t>
-      </w:r>
-      <w:r>
-        <w:rPr>
-          <w:rFonts w:ascii="Calibri" w:hAnsi="Calibri" w:cs="Calibri"/>
-        </w:rPr>
-        <w:t xml:space="preserve"> </w:t>
-      </w:r>
-      <w:r>
-        <w:rPr>
-          <w:rFonts w:ascii="Calibri" w:hAnsi="Calibri" w:cs="Calibri"/>
-        </w:rPr>
-        <w:t>aucun ennemi</w:t>
-      </w:r>
-      <w:r>
-        <w:rPr>
-          <w:rFonts w:ascii="Calibri" w:hAnsi="Calibri" w:cs="Calibri"/>
-        </w:rPr>
-        <w:t xml:space="preserve"> est présent</w:t>
+        <w:jc w:val="both"/>
+        <w:rPr>
+          <w:rFonts w:ascii="Calibri" w:hAnsi="Calibri" w:cs="Calibri"/>
+        </w:rPr>
+      </w:pPr>
+      <w:r>
+        <w:rPr>
+          <w:rFonts w:ascii="Calibri" w:hAnsi="Calibri" w:cs="Calibri"/>
+        </w:rPr>
+        <w:t>Les</w:t>
+      </w:r>
+      <w:r>
+        <w:rPr>
+          <w:rFonts w:ascii="Calibri" w:hAnsi="Calibri" w:cs="Calibri"/>
+        </w:rPr>
+        <w:t xml:space="preserve"> ennemis </w:t>
+      </w:r>
+      <w:r>
+        <w:rPr>
+          <w:rFonts w:ascii="Calibri" w:hAnsi="Calibri" w:cs="Calibri"/>
+        </w:rPr>
+        <w:t>peuvent</w:t>
+      </w:r>
+      <w:r>
+        <w:rPr>
+          <w:rFonts w:ascii="Calibri" w:hAnsi="Calibri" w:cs="Calibri"/>
+        </w:rPr>
+        <w:t xml:space="preserve"> se déplacer d'une case à une case et seulement sur les axes de droite, de gauche, du haut et du bas sur lesquels aucun ennemi est présent</w:t>
       </w:r>
     </w:p>
     <w:p>
@@ -4694,27 +4726,34 @@
           <w:ilvl w:val="0"/>
           <w:numId w:val="26"/>
         </w:numPr>
-        <w:rPr>
-          <w:rFonts w:ascii="Calibri" w:hAnsi="Calibri" w:cs="Calibri"/>
-        </w:rPr>
-      </w:pPr>
-      <w:r>
-        <w:rPr>
-          <w:rFonts w:ascii="Calibri" w:hAnsi="Calibri" w:cs="Calibri"/>
-        </w:rPr>
-        <w:t xml:space="preserve">Je veux que </w:t>
-      </w:r>
-      <w:r>
-        <w:rPr>
-          <w:rFonts w:ascii="Calibri" w:hAnsi="Calibri" w:cs="Calibri"/>
-        </w:rPr>
-        <w:t>les ennemis présents</w:t>
-      </w:r>
-      <w:r>
-        <w:rPr>
-          <w:rFonts w:ascii="Calibri" w:hAnsi="Calibri" w:cs="Calibri"/>
-        </w:rPr>
-        <w:t xml:space="preserve"> sur le premier axe de hauteur aient 1 point de vie</w:t>
+        <w:jc w:val="both"/>
+        <w:rPr>
+          <w:rFonts w:ascii="Calibri" w:hAnsi="Calibri" w:cs="Calibri"/>
+        </w:rPr>
+      </w:pPr>
+      <w:r>
+        <w:rPr>
+          <w:rFonts w:ascii="Calibri" w:hAnsi="Calibri" w:cs="Calibri"/>
+        </w:rPr>
+        <w:t>Les</w:t>
+      </w:r>
+      <w:r>
+        <w:rPr>
+          <w:rFonts w:ascii="Calibri" w:hAnsi="Calibri" w:cs="Calibri"/>
+        </w:rPr>
+        <w:t xml:space="preserve"> ennemis présents sur le premier axe de hauteur </w:t>
+      </w:r>
+      <w:r>
+        <w:rPr>
+          <w:rFonts w:ascii="Calibri" w:hAnsi="Calibri" w:cs="Calibri"/>
+        </w:rPr>
+        <w:t>ont</w:t>
+      </w:r>
+      <w:r>
+        <w:rPr>
+          <w:rFonts w:ascii="Calibri" w:hAnsi="Calibri" w:cs="Calibri"/>
+        </w:rPr>
+        <w:t xml:space="preserve"> 1 point de vie</w:t>
       </w:r>
     </w:p>
     <w:p>
@@ -4724,39 +4763,34 @@
           <w:ilvl w:val="0"/>
           <w:numId w:val="26"/>
         </w:numPr>
-        <w:rPr>
-          <w:rFonts w:ascii="Calibri" w:hAnsi="Calibri" w:cs="Calibri"/>
-        </w:rPr>
-      </w:pPr>
-      <w:r>
-        <w:rPr>
-          <w:rFonts w:ascii="Calibri" w:hAnsi="Calibri" w:cs="Calibri"/>
-        </w:rPr>
-        <w:t xml:space="preserve">Je veux que </w:t>
-      </w:r>
-      <w:r>
-        <w:rPr>
-          <w:rFonts w:ascii="Calibri" w:hAnsi="Calibri" w:cs="Calibri"/>
-        </w:rPr>
-        <w:t>les ennemis présents</w:t>
-      </w:r>
-      <w:r>
-        <w:rPr>
-          <w:rFonts w:ascii="Calibri" w:hAnsi="Calibri" w:cs="Calibri"/>
-        </w:rPr>
-        <w:t xml:space="preserve"> sur le deuxième axe de hauteur aient 2 </w:t>
-      </w:r>
-      <w:r>
-        <w:rPr>
-          <w:rFonts w:ascii="Calibri" w:hAnsi="Calibri" w:cs="Calibri"/>
-        </w:rPr>
-        <w:t>points</w:t>
-      </w:r>
-      <w:r>
-        <w:rPr>
-          <w:rFonts w:ascii="Calibri" w:hAnsi="Calibri" w:cs="Calibri"/>
-        </w:rPr>
-        <w:t xml:space="preserve"> de vie</w:t>
+        <w:jc w:val="both"/>
+        <w:rPr>
+          <w:rFonts w:ascii="Calibri" w:hAnsi="Calibri" w:cs="Calibri"/>
+        </w:rPr>
+      </w:pPr>
+      <w:r>
+        <w:rPr>
+          <w:rFonts w:ascii="Calibri" w:hAnsi="Calibri" w:cs="Calibri"/>
+        </w:rPr>
+        <w:t>Les</w:t>
+      </w:r>
+      <w:r>
+        <w:rPr>
+          <w:rFonts w:ascii="Calibri" w:hAnsi="Calibri" w:cs="Calibri"/>
+        </w:rPr>
+        <w:t xml:space="preserve"> ennemis présents sur le deuxième axe de hauteur </w:t>
+      </w:r>
+      <w:r>
+        <w:rPr>
+          <w:rFonts w:ascii="Calibri" w:hAnsi="Calibri" w:cs="Calibri"/>
+        </w:rPr>
+        <w:t>ont</w:t>
+      </w:r>
+      <w:r>
+        <w:rPr>
+          <w:rFonts w:ascii="Calibri" w:hAnsi="Calibri" w:cs="Calibri"/>
+        </w:rPr>
+        <w:t xml:space="preserve"> 2 points de vie</w:t>
       </w:r>
     </w:p>
     <w:p>
@@ -4766,27 +4800,34 @@
           <w:ilvl w:val="0"/>
           <w:numId w:val="26"/>
         </w:numPr>
-        <w:rPr>
-          <w:rFonts w:ascii="Calibri" w:hAnsi="Calibri" w:cs="Calibri"/>
-        </w:rPr>
-      </w:pPr>
-      <w:r>
-        <w:rPr>
-          <w:rFonts w:ascii="Calibri" w:hAnsi="Calibri" w:cs="Calibri"/>
-        </w:rPr>
-        <w:t xml:space="preserve">Je veux que </w:t>
-      </w:r>
-      <w:r>
-        <w:rPr>
-          <w:rFonts w:ascii="Calibri" w:hAnsi="Calibri" w:cs="Calibri"/>
-        </w:rPr>
-        <w:t>les ennemis présents</w:t>
-      </w:r>
-      <w:r>
-        <w:rPr>
-          <w:rFonts w:ascii="Calibri" w:hAnsi="Calibri" w:cs="Calibri"/>
-        </w:rPr>
-        <w:t xml:space="preserve"> sur le troisième axe de hauteur aient 3 </w:t>
+        <w:jc w:val="both"/>
+        <w:rPr>
+          <w:rFonts w:ascii="Calibri" w:hAnsi="Calibri" w:cs="Calibri"/>
+        </w:rPr>
+      </w:pPr>
+      <w:r>
+        <w:rPr>
+          <w:rFonts w:ascii="Calibri" w:hAnsi="Calibri" w:cs="Calibri"/>
+        </w:rPr>
+        <w:t>Les</w:t>
+      </w:r>
+      <w:r>
+        <w:rPr>
+          <w:rFonts w:ascii="Calibri" w:hAnsi="Calibri" w:cs="Calibri"/>
+        </w:rPr>
+        <w:t xml:space="preserve"> ennemis présents sur le troisième axe de hauteur </w:t>
+      </w:r>
+      <w:r>
+        <w:rPr>
+          <w:rFonts w:ascii="Calibri" w:hAnsi="Calibri" w:cs="Calibri"/>
+        </w:rPr>
+        <w:t>ont</w:t>
+      </w:r>
+      <w:r>
+        <w:rPr>
+          <w:rFonts w:ascii="Calibri" w:hAnsi="Calibri" w:cs="Calibri"/>
+        </w:rPr>
+        <w:t xml:space="preserve"> 3 </w:t>
       </w:r>
       <w:r>
         <w:rPr>
@@ -4808,12 +4849,14 @@
           <w:b/>
           <w:bCs/>
           <w:u w:val="single"/>
-        </w:rPr>
-      </w:pPr>
-      <w:r>
-        <w:rPr>
-          <w:b/>
-          <w:bCs/>
+          <w:lang w:val="en-US"/>
+        </w:rPr>
+      </w:pPr>
+      <w:r>
+        <w:rPr>
+          <w:b/>
+          <w:bCs/>
+          <w:noProof/>
           <w:u w:val="single"/>
         </w:rPr>
         <w:drawing>
@@ -4887,14 +4930,17 @@
           </wp:anchor>
         </w:drawing>
       </w:r>
+      <w:proofErr w:type="gramStart"/>
       <w:r>
         <w:rPr>
           <w:b/>
           <w:bCs/>
           <w:u w:val="single"/>
+          <w:lang w:val="en-US"/>
         </w:rPr>
         <w:t>Maquette :</w:t>
       </w:r>
+      <w:proofErr w:type="gramEnd"/>
     </w:p>
     <w:p>
       <w:pPr>
@@ -4916,7 +4962,7 @@
           <w:lang w:val="en-US"/>
         </w:rPr>
       </w:pPr>
-      <w:bookmarkStart w:id="7" w:name="_Toc240030437"/>
+      <w:bookmarkStart w:id="7" w:name="_Toc240034956"/>
       <w:r>
         <w:rPr>
           <w:rFonts w:ascii="Calibri" w:hAnsi="Calibri" w:cs="Calibri"/>
@@ -4937,6 +4983,7 @@
           <w:b/>
           <w:bCs/>
           <w:u w:val="single"/>
+          <w:lang w:val="en-US"/>
         </w:rPr>
       </w:pPr>
       <w:r>
@@ -4944,21 +4991,35 @@
           <w:b/>
           <w:bCs/>
           <w:u w:val="single"/>
-        </w:rPr>
-        <w:t>User Story :</w:t>
-      </w:r>
+          <w:lang w:val="en-US"/>
+        </w:rPr>
+        <w:t xml:space="preserve">User </w:t>
+      </w:r>
+      <w:proofErr w:type="gramStart"/>
+      <w:r>
+        <w:rPr>
+          <w:b/>
+          <w:bCs/>
+          <w:u w:val="single"/>
+          <w:lang w:val="en-US"/>
+        </w:rPr>
+        <w:t>Story :</w:t>
+      </w:r>
+      <w:proofErr w:type="gramEnd"/>
     </w:p>
     <w:p>
       <w:pPr>
         <w:ind w:left="284"/>
-        <w:rPr>
-          <w:rFonts w:ascii="Calibri" w:hAnsi="Calibri" w:cs="Calibri"/>
-        </w:rPr>
-      </w:pPr>
-      <w:r>
-        <w:rPr>
-          <w:rFonts w:ascii="Calibri" w:hAnsi="Calibri" w:cs="Calibri"/>
-        </w:rPr>
+        <w:jc w:val="both"/>
+        <w:rPr>
+          <w:rFonts w:ascii="Calibri" w:hAnsi="Calibri" w:cs="Calibri"/>
+        </w:rPr>
+      </w:pPr>
+      <w:r>
+        <w:rPr>
+          <w:rFonts w:ascii="Calibri" w:hAnsi="Calibri" w:cs="Calibri"/>
+        </w:rPr>
+        <w:lastRenderedPageBreak/>
         <w:t>En tant que joueur, je veux pouvoir avoir des protections, afin d'être protégé des attaques des ennemis</w:t>
       </w:r>
       <w:r>
@@ -5001,15 +5062,34 @@
           <w:ilvl w:val="0"/>
           <w:numId w:val="26"/>
         </w:numPr>
-        <w:rPr>
-          <w:rFonts w:ascii="Calibri" w:hAnsi="Calibri" w:cs="Calibri"/>
-        </w:rPr>
-      </w:pPr>
-      <w:r>
-        <w:rPr>
-          <w:rFonts w:ascii="Calibri" w:hAnsi="Calibri" w:cs="Calibri"/>
-        </w:rPr>
-        <w:t>Je veux que les protections se casse après 5 coup reçu d'ennemis, sur elles</w:t>
+        <w:jc w:val="both"/>
+        <w:rPr>
+          <w:rFonts w:ascii="Calibri" w:hAnsi="Calibri" w:cs="Calibri"/>
+        </w:rPr>
+      </w:pPr>
+      <w:r>
+        <w:rPr>
+          <w:rFonts w:ascii="Calibri" w:hAnsi="Calibri" w:cs="Calibri"/>
+        </w:rPr>
+        <w:t>L</w:t>
+      </w:r>
+      <w:r>
+        <w:rPr>
+          <w:rFonts w:ascii="Calibri" w:hAnsi="Calibri" w:cs="Calibri"/>
+        </w:rPr>
+        <w:t>es protections se casse après 5 coup reçu d</w:t>
+      </w:r>
+      <w:r>
+        <w:rPr>
+          <w:rFonts w:ascii="Calibri" w:hAnsi="Calibri" w:cs="Calibri"/>
+        </w:rPr>
+        <w:t xml:space="preserve">’un </w:t>
+      </w:r>
+      <w:r>
+        <w:rPr>
+          <w:rFonts w:ascii="Calibri" w:hAnsi="Calibri" w:cs="Calibri"/>
+        </w:rPr>
+        <w:t>ennemi</w:t>
       </w:r>
     </w:p>
     <w:p>
@@ -5019,27 +5099,22 @@
           <w:ilvl w:val="0"/>
           <w:numId w:val="26"/>
         </w:numPr>
-        <w:rPr>
-          <w:rFonts w:ascii="Calibri" w:hAnsi="Calibri" w:cs="Calibri"/>
-        </w:rPr>
-      </w:pPr>
-      <w:r>
-        <w:rPr>
-          <w:rFonts w:ascii="Calibri" w:hAnsi="Calibri" w:cs="Calibri"/>
-        </w:rPr>
-        <w:t xml:space="preserve">Je veux que quand </w:t>
-      </w:r>
-      <w:r>
-        <w:rPr>
-          <w:rFonts w:ascii="Calibri" w:hAnsi="Calibri" w:cs="Calibri"/>
-        </w:rPr>
-        <w:t>un projectile ennemi</w:t>
-      </w:r>
-      <w:r>
-        <w:rPr>
-          <w:rFonts w:ascii="Calibri" w:hAnsi="Calibri" w:cs="Calibri"/>
-        </w:rPr>
-        <w:t xml:space="preserve"> touche une protection le projectile disparait et la protection perd en durabilité</w:t>
+        <w:jc w:val="both"/>
+        <w:rPr>
+          <w:rFonts w:ascii="Calibri" w:hAnsi="Calibri" w:cs="Calibri"/>
+        </w:rPr>
+      </w:pPr>
+      <w:r>
+        <w:rPr>
+          <w:rFonts w:ascii="Calibri" w:hAnsi="Calibri" w:cs="Calibri"/>
+        </w:rPr>
+        <w:t>Q</w:t>
+      </w:r>
+      <w:r>
+        <w:rPr>
+          <w:rFonts w:ascii="Calibri" w:hAnsi="Calibri" w:cs="Calibri"/>
+        </w:rPr>
+        <w:t>uand un projectile ennemi touche une protection le projectile disparait et la protection perd en durabilité</w:t>
       </w:r>
     </w:p>
     <w:p>
@@ -5049,15 +5124,22 @@
           <w:ilvl w:val="0"/>
           <w:numId w:val="26"/>
         </w:numPr>
-        <w:rPr>
-          <w:rFonts w:ascii="Calibri" w:hAnsi="Calibri" w:cs="Calibri"/>
-        </w:rPr>
-      </w:pPr>
-      <w:r>
-        <w:rPr>
-          <w:rFonts w:ascii="Calibri" w:hAnsi="Calibri" w:cs="Calibri"/>
-        </w:rPr>
-        <w:t>Je veux que quand le personnage tirs sur une protection le projectile disparait mais la protection ne subit aucun dégât</w:t>
+        <w:jc w:val="both"/>
+        <w:rPr>
+          <w:rFonts w:ascii="Calibri" w:hAnsi="Calibri" w:cs="Calibri"/>
+        </w:rPr>
+      </w:pPr>
+      <w:r>
+        <w:rPr>
+          <w:rFonts w:ascii="Calibri" w:hAnsi="Calibri" w:cs="Calibri"/>
+        </w:rPr>
+        <w:t>Q</w:t>
+      </w:r>
+      <w:r>
+        <w:rPr>
+          <w:rFonts w:ascii="Calibri" w:hAnsi="Calibri" w:cs="Calibri"/>
+        </w:rPr>
+        <w:t>uand le personnage tirs sur une protection le projectile disparait mais la protection ne subit aucun dégât</w:t>
       </w:r>
     </w:p>
     <w:p>
@@ -5067,12 +5149,14 @@
           <w:b/>
           <w:bCs/>
           <w:u w:val="single"/>
-        </w:rPr>
-      </w:pPr>
-      <w:r>
-        <w:rPr>
-          <w:b/>
-          <w:bCs/>
+          <w:lang w:val="en-US"/>
+        </w:rPr>
+      </w:pPr>
+      <w:r>
+        <w:rPr>
+          <w:b/>
+          <w:bCs/>
+          <w:noProof/>
           <w:u w:val="single"/>
         </w:rPr>
         <w:drawing>
@@ -5146,14 +5230,17 @@
           </wp:anchor>
         </w:drawing>
       </w:r>
+      <w:proofErr w:type="gramStart"/>
       <w:r>
         <w:rPr>
           <w:b/>
           <w:bCs/>
           <w:u w:val="single"/>
+          <w:lang w:val="en-US"/>
         </w:rPr>
         <w:t>Maquette :</w:t>
       </w:r>
+      <w:proofErr w:type="gramEnd"/>
     </w:p>
     <w:p>
       <w:pPr>
@@ -5181,7 +5268,7 @@
           <w:lang w:val="en-US"/>
         </w:rPr>
       </w:pPr>
-      <w:bookmarkStart w:id="8" w:name="_Toc240030438"/>
+      <w:bookmarkStart w:id="8" w:name="_Toc240034957"/>
       <w:r>
         <w:rPr>
           <w:rFonts w:ascii="Calibri" w:hAnsi="Calibri" w:cs="Calibri"/>
@@ -5213,6 +5300,7 @@
           <w:b/>
           <w:bCs/>
           <w:u w:val="single"/>
+          <w:lang w:val="en-US"/>
         </w:rPr>
       </w:pPr>
       <w:r>
@@ -5220,13 +5308,26 @@
           <w:b/>
           <w:bCs/>
           <w:u w:val="single"/>
-        </w:rPr>
-        <w:t>User Story :</w:t>
-      </w:r>
+          <w:lang w:val="en-US"/>
+        </w:rPr>
+        <w:t xml:space="preserve">User </w:t>
+      </w:r>
+      <w:proofErr w:type="gramStart"/>
+      <w:r>
+        <w:rPr>
+          <w:b/>
+          <w:bCs/>
+          <w:u w:val="single"/>
+          <w:lang w:val="en-US"/>
+        </w:rPr>
+        <w:t>Story :</w:t>
+      </w:r>
+      <w:proofErr w:type="gramEnd"/>
     </w:p>
     <w:p>
       <w:pPr>
         <w:ind w:left="284"/>
+        <w:jc w:val="both"/>
         <w:rPr>
           <w:rFonts w:ascii="Calibri" w:hAnsi="Calibri" w:cs="Calibri"/>
         </w:rPr>
@@ -5277,15 +5378,22 @@
           <w:ilvl w:val="0"/>
           <w:numId w:val="26"/>
         </w:numPr>
-        <w:rPr>
-          <w:rFonts w:ascii="Calibri" w:hAnsi="Calibri" w:cs="Calibri"/>
-        </w:rPr>
-      </w:pPr>
-      <w:r>
-        <w:rPr>
-          <w:rFonts w:ascii="Calibri" w:hAnsi="Calibri" w:cs="Calibri"/>
-        </w:rPr>
-        <w:t>Je veux avoir un score en direct sur l'interface de jeux</w:t>
+        <w:jc w:val="both"/>
+        <w:rPr>
+          <w:rFonts w:ascii="Calibri" w:hAnsi="Calibri" w:cs="Calibri"/>
+        </w:rPr>
+      </w:pPr>
+      <w:r>
+        <w:rPr>
+          <w:rFonts w:ascii="Calibri" w:hAnsi="Calibri" w:cs="Calibri"/>
+        </w:rPr>
+        <w:t>Il y a</w:t>
+      </w:r>
+      <w:r>
+        <w:rPr>
+          <w:rFonts w:ascii="Calibri" w:hAnsi="Calibri" w:cs="Calibri"/>
+        </w:rPr>
+        <w:t xml:space="preserve"> un score en direct sur l'interface de jeux</w:t>
       </w:r>
     </w:p>
     <w:p>
@@ -5295,27 +5403,46 @@
           <w:ilvl w:val="0"/>
           <w:numId w:val="26"/>
         </w:numPr>
-        <w:rPr>
-          <w:rFonts w:ascii="Calibri" w:hAnsi="Calibri" w:cs="Calibri"/>
-        </w:rPr>
-      </w:pPr>
-      <w:r>
-        <w:rPr>
-          <w:rFonts w:ascii="Calibri" w:hAnsi="Calibri" w:cs="Calibri"/>
-        </w:rPr>
-        <w:t xml:space="preserve">Je veux que à chaque </w:t>
-      </w:r>
-      <w:r>
-        <w:rPr>
-          <w:rFonts w:ascii="Calibri" w:hAnsi="Calibri" w:cs="Calibri"/>
-        </w:rPr>
-        <w:t>ennemi</w:t>
-      </w:r>
-      <w:r>
-        <w:rPr>
-          <w:rFonts w:ascii="Calibri" w:hAnsi="Calibri" w:cs="Calibri"/>
-        </w:rPr>
-        <w:t xml:space="preserve"> que je tue mon score augmente</w:t>
+        <w:jc w:val="both"/>
+        <w:rPr>
+          <w:rFonts w:ascii="Calibri" w:hAnsi="Calibri" w:cs="Calibri"/>
+        </w:rPr>
+      </w:pPr>
+      <w:r>
+        <w:rPr>
+          <w:rFonts w:ascii="Calibri" w:hAnsi="Calibri" w:cs="Calibri"/>
+        </w:rPr>
+        <w:t xml:space="preserve">A </w:t>
+      </w:r>
+      <w:r>
+        <w:rPr>
+          <w:rFonts w:ascii="Calibri" w:hAnsi="Calibri" w:cs="Calibri"/>
+        </w:rPr>
+        <w:t xml:space="preserve">chaque ennemi </w:t>
+      </w:r>
+      <w:r>
+        <w:rPr>
+          <w:rFonts w:ascii="Calibri" w:hAnsi="Calibri" w:cs="Calibri"/>
+        </w:rPr>
+        <w:t>tués</w:t>
+      </w:r>
+      <w:r>
+        <w:rPr>
+          <w:rFonts w:ascii="Calibri" w:hAnsi="Calibri" w:cs="Calibri"/>
+        </w:rPr>
+        <w:t xml:space="preserve"> </w:t>
+      </w:r>
+      <w:r>
+        <w:rPr>
+          <w:rFonts w:ascii="Calibri" w:hAnsi="Calibri" w:cs="Calibri"/>
+        </w:rPr>
+        <w:t>le</w:t>
+      </w:r>
+      <w:r>
+        <w:rPr>
+          <w:rFonts w:ascii="Calibri" w:hAnsi="Calibri" w:cs="Calibri"/>
+        </w:rPr>
+        <w:t xml:space="preserve"> score augmente</w:t>
       </w:r>
     </w:p>
     <w:p>
@@ -5331,11 +5458,12 @@
         <w:rPr>
           <w:b/>
           <w:bCs/>
+          <w:noProof/>
           <w:u w:val="single"/>
         </w:rPr>
         <w:lastRenderedPageBreak/>
         <w:drawing>
-          <wp:anchor distT="0" distB="0" distL="114300" distR="114300" simplePos="0" relativeHeight="251680768" behindDoc="0" locked="0" layoutInCell="1" allowOverlap="1" wp14:anchorId="4AF39C50" wp14:editId="1D9F2393">
+          <wp:anchor distT="0" distB="0" distL="114300" distR="114300" simplePos="0" relativeHeight="251680768" behindDoc="0" locked="0" layoutInCell="1" allowOverlap="1" wp14:anchorId="4AF39C50" wp14:editId="3ED3A359">
             <wp:simplePos x="0" y="0"/>
             <wp:positionH relativeFrom="margin">
               <wp:posOffset>1585595</wp:posOffset>
@@ -5426,7 +5554,7 @@
           <w:szCs w:val="36"/>
         </w:rPr>
       </w:pPr>
-      <w:bookmarkStart w:id="9" w:name="_Toc240030439"/>
+      <w:bookmarkStart w:id="9" w:name="_Toc240034958"/>
       <w:r>
         <w:rPr>
           <w:rFonts w:ascii="Calibri" w:hAnsi="Calibri" w:cs="Calibri"/>
@@ -5482,6 +5610,7 @@
     <w:p>
       <w:pPr>
         <w:ind w:left="284"/>
+        <w:jc w:val="both"/>
         <w:rPr>
           <w:rFonts w:ascii="Calibri" w:hAnsi="Calibri" w:cs="Calibri"/>
         </w:rPr>
@@ -5532,15 +5661,22 @@
           <w:ilvl w:val="0"/>
           <w:numId w:val="26"/>
         </w:numPr>
-        <w:rPr>
-          <w:rFonts w:ascii="Calibri" w:hAnsi="Calibri" w:cs="Calibri"/>
-        </w:rPr>
-      </w:pPr>
-      <w:r>
-        <w:rPr>
-          <w:rFonts w:ascii="Calibri" w:hAnsi="Calibri" w:cs="Calibri"/>
-        </w:rPr>
-        <w:t>Je veux avoir 3 vies</w:t>
+        <w:jc w:val="both"/>
+        <w:rPr>
+          <w:rFonts w:ascii="Calibri" w:hAnsi="Calibri" w:cs="Calibri"/>
+        </w:rPr>
+      </w:pPr>
+      <w:r>
+        <w:rPr>
+          <w:rFonts w:ascii="Calibri" w:hAnsi="Calibri" w:cs="Calibri"/>
+        </w:rPr>
+        <w:t xml:space="preserve">Le joueur possède </w:t>
+      </w:r>
+      <w:r>
+        <w:rPr>
+          <w:rFonts w:ascii="Calibri" w:hAnsi="Calibri" w:cs="Calibri"/>
+        </w:rPr>
+        <w:t>3 vies</w:t>
       </w:r>
     </w:p>
     <w:p>
@@ -5550,15 +5686,40 @@
           <w:ilvl w:val="0"/>
           <w:numId w:val="26"/>
         </w:numPr>
-        <w:rPr>
-          <w:rFonts w:ascii="Calibri" w:hAnsi="Calibri" w:cs="Calibri"/>
-        </w:rPr>
-      </w:pPr>
-      <w:r>
-        <w:rPr>
-          <w:rFonts w:ascii="Calibri" w:hAnsi="Calibri" w:cs="Calibri"/>
-        </w:rPr>
-        <w:t>Quand je me fais toucher je veux perdre une vie</w:t>
+        <w:jc w:val="both"/>
+        <w:rPr>
+          <w:rFonts w:ascii="Calibri" w:hAnsi="Calibri" w:cs="Calibri"/>
+        </w:rPr>
+      </w:pPr>
+      <w:r>
+        <w:rPr>
+          <w:rFonts w:ascii="Calibri" w:hAnsi="Calibri" w:cs="Calibri"/>
+        </w:rPr>
+        <w:t xml:space="preserve">Quand </w:t>
+      </w:r>
+      <w:r>
+        <w:rPr>
+          <w:rFonts w:ascii="Calibri" w:hAnsi="Calibri" w:cs="Calibri"/>
+        </w:rPr>
+        <w:t>le personnage se fais</w:t>
+      </w:r>
+      <w:r>
+        <w:rPr>
+          <w:rFonts w:ascii="Calibri" w:hAnsi="Calibri" w:cs="Calibri"/>
+        </w:rPr>
+        <w:t xml:space="preserve"> toucher </w:t>
+      </w:r>
+      <w:r>
+        <w:rPr>
+          <w:rFonts w:ascii="Calibri" w:hAnsi="Calibri" w:cs="Calibri"/>
+        </w:rPr>
+        <w:t>il</w:t>
+      </w:r>
+      <w:r>
+        <w:rPr>
+          <w:rFonts w:ascii="Calibri" w:hAnsi="Calibri" w:cs="Calibri"/>
+        </w:rPr>
+        <w:t xml:space="preserve"> perd une vie</w:t>
       </w:r>
     </w:p>
     <w:p>
@@ -5568,15 +5729,28 @@
           <w:ilvl w:val="0"/>
           <w:numId w:val="26"/>
         </w:numPr>
-        <w:rPr>
-          <w:rFonts w:ascii="Calibri" w:hAnsi="Calibri" w:cs="Calibri"/>
-        </w:rPr>
-      </w:pPr>
-      <w:r>
-        <w:rPr>
-          <w:rFonts w:ascii="Calibri" w:hAnsi="Calibri" w:cs="Calibri"/>
-        </w:rPr>
-        <w:t>Une fois mes 3 vies épuisées la partie s'arrête</w:t>
+        <w:jc w:val="both"/>
+        <w:rPr>
+          <w:rFonts w:ascii="Calibri" w:hAnsi="Calibri" w:cs="Calibri"/>
+        </w:rPr>
+      </w:pPr>
+      <w:r>
+        <w:rPr>
+          <w:rFonts w:ascii="Calibri" w:hAnsi="Calibri" w:cs="Calibri"/>
+        </w:rPr>
+        <w:t xml:space="preserve">Une fois </w:t>
+      </w:r>
+      <w:r>
+        <w:rPr>
+          <w:rFonts w:ascii="Calibri" w:hAnsi="Calibri" w:cs="Calibri"/>
+        </w:rPr>
+        <w:t>ses</w:t>
+      </w:r>
+      <w:r>
+        <w:rPr>
+          <w:rFonts w:ascii="Calibri" w:hAnsi="Calibri" w:cs="Calibri"/>
+        </w:rPr>
+        <w:t xml:space="preserve"> 3 vies épuisées la partie s'arrête</w:t>
       </w:r>
     </w:p>
     <w:p>
@@ -5586,27 +5760,34 @@
           <w:ilvl w:val="0"/>
           <w:numId w:val="26"/>
         </w:numPr>
-        <w:rPr>
-          <w:rFonts w:ascii="Calibri" w:hAnsi="Calibri" w:cs="Calibri"/>
-        </w:rPr>
-      </w:pPr>
-      <w:r>
-        <w:rPr>
-          <w:rFonts w:ascii="Calibri" w:hAnsi="Calibri" w:cs="Calibri"/>
-        </w:rPr>
-        <w:t xml:space="preserve">Je veux savoir </w:t>
-      </w:r>
-      <w:r>
-        <w:rPr>
-          <w:rFonts w:ascii="Calibri" w:hAnsi="Calibri" w:cs="Calibri"/>
-        </w:rPr>
-        <w:t>le nombre</w:t>
-      </w:r>
-      <w:r>
-        <w:rPr>
-          <w:rFonts w:ascii="Calibri" w:hAnsi="Calibri" w:cs="Calibri"/>
-        </w:rPr>
-        <w:t xml:space="preserve"> de vie qu'il me reste via une interface pendant la partie</w:t>
+        <w:jc w:val="both"/>
+        <w:rPr>
+          <w:rFonts w:ascii="Calibri" w:hAnsi="Calibri" w:cs="Calibri"/>
+        </w:rPr>
+      </w:pPr>
+      <w:r>
+        <w:rPr>
+          <w:rFonts w:ascii="Calibri" w:hAnsi="Calibri" w:cs="Calibri"/>
+        </w:rPr>
+        <w:t>Le joueur peut consulter</w:t>
+      </w:r>
+      <w:r>
+        <w:rPr>
+          <w:rFonts w:ascii="Calibri" w:hAnsi="Calibri" w:cs="Calibri"/>
+        </w:rPr>
+        <w:t xml:space="preserve"> le nombre de vie qu'il </w:t>
+      </w:r>
+      <w:r>
+        <w:rPr>
+          <w:rFonts w:ascii="Calibri" w:hAnsi="Calibri" w:cs="Calibri"/>
+        </w:rPr>
+        <w:t xml:space="preserve">lui </w:t>
+      </w:r>
+      <w:r>
+        <w:rPr>
+          <w:rFonts w:ascii="Calibri" w:hAnsi="Calibri" w:cs="Calibri"/>
+        </w:rPr>
+        <w:t>reste via une interface pendant la partie</w:t>
       </w:r>
     </w:p>
     <w:p>
@@ -5622,19 +5803,20 @@
         <w:rPr>
           <w:b/>
           <w:bCs/>
+          <w:noProof/>
           <w:u w:val="single"/>
         </w:rPr>
         <w:drawing>
-          <wp:anchor distT="0" distB="0" distL="114300" distR="114300" simplePos="0" relativeHeight="251682816" behindDoc="0" locked="0" layoutInCell="1" allowOverlap="1" wp14:anchorId="49037DFB" wp14:editId="429D0A40">
+          <wp:anchor distT="0" distB="0" distL="114300" distR="114300" simplePos="0" relativeHeight="251682816" behindDoc="0" locked="0" layoutInCell="1" allowOverlap="1" wp14:anchorId="49037DFB" wp14:editId="7024B55B">
             <wp:simplePos x="0" y="0"/>
             <wp:positionH relativeFrom="margin">
-              <wp:posOffset>1593215</wp:posOffset>
+              <wp:align>center</wp:align>
             </wp:positionH>
             <wp:positionV relativeFrom="paragraph">
-              <wp:posOffset>398780</wp:posOffset>
+              <wp:posOffset>526415</wp:posOffset>
             </wp:positionV>
-            <wp:extent cx="2567305" cy="2606675"/>
-            <wp:effectExtent l="76200" t="38100" r="80645" b="117475"/>
+            <wp:extent cx="2225219" cy="2259827"/>
+            <wp:effectExtent l="76200" t="38100" r="80010" b="121920"/>
             <wp:wrapTopAndBottom/>
             <wp:docPr id="99011179" name="Image 1"/>
             <wp:cNvGraphicFramePr>
@@ -5662,7 +5844,7 @@
                   <pic:spPr>
                     <a:xfrm>
                       <a:off x="0" y="0"/>
-                      <a:ext cx="2567305" cy="2606675"/>
+                      <a:ext cx="2225219" cy="2259827"/>
                     </a:xfrm>
                     <a:prstGeom prst="rect">
                       <a:avLst/>
@@ -5716,7 +5898,7 @@
           <w:szCs w:val="36"/>
         </w:rPr>
       </w:pPr>
-      <w:bookmarkStart w:id="10" w:name="_Toc240030440"/>
+      <w:bookmarkStart w:id="10" w:name="_Toc240034959"/>
       <w:r>
         <w:rPr>
           <w:rFonts w:ascii="Calibri" w:hAnsi="Calibri" w:cs="Calibri"/>
@@ -5783,6 +5965,7 @@
     <w:p>
       <w:pPr>
         <w:ind w:left="284"/>
+        <w:jc w:val="both"/>
         <w:rPr>
           <w:rFonts w:ascii="Calibri" w:hAnsi="Calibri" w:cs="Calibri"/>
         </w:rPr>
@@ -5833,27 +6016,28 @@
           <w:ilvl w:val="0"/>
           <w:numId w:val="26"/>
         </w:numPr>
-        <w:rPr>
-          <w:rFonts w:ascii="Calibri" w:hAnsi="Calibri" w:cs="Calibri"/>
-        </w:rPr>
-      </w:pPr>
-      <w:r>
-        <w:rPr>
-          <w:rFonts w:ascii="Calibri" w:hAnsi="Calibri" w:cs="Calibri"/>
-        </w:rPr>
-        <w:t xml:space="preserve">Au </w:t>
-      </w:r>
-      <w:r>
-        <w:rPr>
-          <w:rFonts w:ascii="Calibri" w:hAnsi="Calibri" w:cs="Calibri"/>
-        </w:rPr>
-        <w:t>lancement</w:t>
-      </w:r>
-      <w:r>
-        <w:rPr>
-          <w:rFonts w:ascii="Calibri" w:hAnsi="Calibri" w:cs="Calibri"/>
-        </w:rPr>
-        <w:t xml:space="preserve"> du jeux je veux arriver sur une interface graphique</w:t>
+        <w:jc w:val="both"/>
+        <w:rPr>
+          <w:rFonts w:ascii="Calibri" w:hAnsi="Calibri" w:cs="Calibri"/>
+        </w:rPr>
+      </w:pPr>
+      <w:r>
+        <w:rPr>
+          <w:rFonts w:ascii="Calibri" w:hAnsi="Calibri" w:cs="Calibri"/>
+        </w:rPr>
+        <w:t xml:space="preserve">Au lancement du jeux </w:t>
+      </w:r>
+      <w:r>
+        <w:rPr>
+          <w:rFonts w:ascii="Calibri" w:hAnsi="Calibri" w:cs="Calibri"/>
+        </w:rPr>
+        <w:t xml:space="preserve">le joueur </w:t>
+      </w:r>
+      <w:r>
+        <w:rPr>
+          <w:rFonts w:ascii="Calibri" w:hAnsi="Calibri" w:cs="Calibri"/>
+        </w:rPr>
+        <w:t>arrive sur une interface graphique</w:t>
       </w:r>
     </w:p>
     <w:p>
@@ -5863,21 +6047,22 @@
           <w:ilvl w:val="0"/>
           <w:numId w:val="26"/>
         </w:numPr>
-        <w:rPr>
-          <w:rFonts w:ascii="Calibri" w:hAnsi="Calibri" w:cs="Calibri"/>
-        </w:rPr>
-      </w:pPr>
-      <w:r>
-        <w:rPr>
-          <w:rFonts w:ascii="Calibri" w:hAnsi="Calibri" w:cs="Calibri"/>
-        </w:rPr>
-        <w:t xml:space="preserve">Sur l'interface je veux le titre </w:t>
-      </w:r>
-      <w:r>
-        <w:rPr>
-          <w:rFonts w:ascii="Calibri" w:hAnsi="Calibri" w:cs="Calibri"/>
-        </w:rPr>
-        <w:t>du jeu</w:t>
+        <w:jc w:val="both"/>
+        <w:rPr>
+          <w:rFonts w:ascii="Calibri" w:hAnsi="Calibri" w:cs="Calibri"/>
+        </w:rPr>
+      </w:pPr>
+      <w:r>
+        <w:rPr>
+          <w:rFonts w:ascii="Calibri" w:hAnsi="Calibri" w:cs="Calibri"/>
+        </w:rPr>
+        <w:t>Sur l'interface le titre du jeu</w:t>
+      </w:r>
+      <w:r>
+        <w:rPr>
+          <w:rFonts w:ascii="Calibri" w:hAnsi="Calibri" w:cs="Calibri"/>
+        </w:rPr>
+        <w:t xml:space="preserve"> est présent</w:t>
       </w:r>
     </w:p>
     <w:p>
@@ -5887,15 +6072,28 @@
           <w:ilvl w:val="0"/>
           <w:numId w:val="26"/>
         </w:numPr>
-        <w:rPr>
-          <w:rFonts w:ascii="Calibri" w:hAnsi="Calibri" w:cs="Calibri"/>
-        </w:rPr>
-      </w:pPr>
-      <w:r>
-        <w:rPr>
-          <w:rFonts w:ascii="Calibri" w:hAnsi="Calibri" w:cs="Calibri"/>
-        </w:rPr>
-        <w:t>Sur l'interface je veux un bouton qui me permet de lancer une partie</w:t>
+        <w:jc w:val="both"/>
+        <w:rPr>
+          <w:rFonts w:ascii="Calibri" w:hAnsi="Calibri" w:cs="Calibri"/>
+        </w:rPr>
+      </w:pPr>
+      <w:r>
+        <w:rPr>
+          <w:rFonts w:ascii="Calibri" w:hAnsi="Calibri" w:cs="Calibri"/>
+        </w:rPr>
+        <w:t>Sur l'interface un bouton qui permet de lancer une partie</w:t>
+      </w:r>
+      <w:r>
+        <w:rPr>
+          <w:rFonts w:ascii="Calibri" w:hAnsi="Calibri" w:cs="Calibri"/>
+        </w:rPr>
+        <w:t xml:space="preserve"> </w:t>
+      </w:r>
+      <w:r>
+        <w:rPr>
+          <w:rFonts w:ascii="Calibri" w:hAnsi="Calibri" w:cs="Calibri"/>
+        </w:rPr>
+        <w:t>est présent</w:t>
       </w:r>
     </w:p>
     <w:p>
@@ -5905,21 +6103,40 @@
           <w:ilvl w:val="0"/>
           <w:numId w:val="26"/>
         </w:numPr>
-        <w:rPr>
-          <w:rFonts w:ascii="Calibri" w:hAnsi="Calibri" w:cs="Calibri"/>
-        </w:rPr>
-      </w:pPr>
-      <w:r>
-        <w:rPr>
-          <w:rFonts w:ascii="Calibri" w:hAnsi="Calibri" w:cs="Calibri"/>
-        </w:rPr>
-        <w:t xml:space="preserve">Sur l'interface je veux un bouton pour quitter </w:t>
-      </w:r>
-      <w:r>
-        <w:rPr>
-          <w:rFonts w:ascii="Calibri" w:hAnsi="Calibri" w:cs="Calibri"/>
-        </w:rPr>
-        <w:t>le jeu</w:t>
+        <w:jc w:val="both"/>
+        <w:rPr>
+          <w:rFonts w:ascii="Calibri" w:hAnsi="Calibri" w:cs="Calibri"/>
+        </w:rPr>
+      </w:pPr>
+      <w:r>
+        <w:rPr>
+          <w:rFonts w:ascii="Calibri" w:hAnsi="Calibri" w:cs="Calibri"/>
+        </w:rPr>
+        <w:t xml:space="preserve">Sur l'interface un bouton </w:t>
+      </w:r>
+      <w:r>
+        <w:rPr>
+          <w:rFonts w:ascii="Calibri" w:hAnsi="Calibri" w:cs="Calibri"/>
+        </w:rPr>
+        <w:t>qui permet de</w:t>
+      </w:r>
+      <w:r>
+        <w:rPr>
+          <w:rFonts w:ascii="Calibri" w:hAnsi="Calibri" w:cs="Calibri"/>
+        </w:rPr>
+        <w:t xml:space="preserve"> quitter le jeu</w:t>
+      </w:r>
+      <w:r>
+        <w:rPr>
+          <w:rFonts w:ascii="Calibri" w:hAnsi="Calibri" w:cs="Calibri"/>
+        </w:rPr>
+        <w:t xml:space="preserve"> </w:t>
+      </w:r>
+      <w:r>
+        <w:rPr>
+          <w:rFonts w:ascii="Calibri" w:hAnsi="Calibri" w:cs="Calibri"/>
+        </w:rPr>
+        <w:t>est présent</w:t>
       </w:r>
     </w:p>
     <w:p>
@@ -5929,27 +6146,76 @@
           <w:ilvl w:val="0"/>
           <w:numId w:val="26"/>
         </w:numPr>
-        <w:rPr>
-          <w:rFonts w:ascii="Calibri" w:hAnsi="Calibri" w:cs="Calibri"/>
-        </w:rPr>
-      </w:pPr>
-      <w:r>
-        <w:rPr>
-          <w:rFonts w:ascii="Calibri" w:hAnsi="Calibri" w:cs="Calibri"/>
-        </w:rPr>
-        <w:t xml:space="preserve">Sur l'interface je veux un bouton pour accéder au paramètre qui me permette de modifier la langue </w:t>
-      </w:r>
-      <w:r>
-        <w:rPr>
-          <w:rFonts w:ascii="Calibri" w:hAnsi="Calibri" w:cs="Calibri"/>
-        </w:rPr>
-        <w:t>du jeu</w:t>
-      </w:r>
-      <w:r>
-        <w:rPr>
-          <w:rFonts w:ascii="Calibri" w:hAnsi="Calibri" w:cs="Calibri"/>
-        </w:rPr>
-        <w:t xml:space="preserve"> ou les contrôles</w:t>
+        <w:jc w:val="both"/>
+        <w:rPr>
+          <w:rFonts w:ascii="Calibri" w:hAnsi="Calibri" w:cs="Calibri"/>
+        </w:rPr>
+      </w:pPr>
+      <w:r>
+        <w:rPr>
+          <w:rFonts w:ascii="Calibri" w:hAnsi="Calibri" w:cs="Calibri"/>
+        </w:rPr>
+        <w:t xml:space="preserve">Sur l'interface un bouton </w:t>
+      </w:r>
+      <w:r>
+        <w:rPr>
+          <w:rFonts w:ascii="Calibri" w:hAnsi="Calibri" w:cs="Calibri"/>
+        </w:rPr>
+        <w:t>qui permet d’</w:t>
+      </w:r>
+      <w:r>
+        <w:rPr>
+          <w:rFonts w:ascii="Calibri" w:hAnsi="Calibri" w:cs="Calibri"/>
+        </w:rPr>
+        <w:t xml:space="preserve">accéder au paramètre </w:t>
+      </w:r>
+      <w:r>
+        <w:rPr>
+          <w:rFonts w:ascii="Calibri" w:hAnsi="Calibri" w:cs="Calibri"/>
+        </w:rPr>
+        <w:t>dans les quels</w:t>
+      </w:r>
+      <w:r>
+        <w:rPr>
+          <w:rFonts w:ascii="Calibri" w:hAnsi="Calibri" w:cs="Calibri"/>
+        </w:rPr>
+        <w:t xml:space="preserve"> une</w:t>
+      </w:r>
+      <w:r>
+        <w:rPr>
+          <w:rFonts w:ascii="Calibri" w:hAnsi="Calibri" w:cs="Calibri"/>
+        </w:rPr>
+        <w:t xml:space="preserve"> modifi</w:t>
+      </w:r>
+      <w:r>
+        <w:rPr>
+          <w:rFonts w:ascii="Calibri" w:hAnsi="Calibri" w:cs="Calibri"/>
+        </w:rPr>
+        <w:t>cation de</w:t>
+      </w:r>
+      <w:r>
+        <w:rPr>
+          <w:rFonts w:ascii="Calibri" w:hAnsi="Calibri" w:cs="Calibri"/>
+        </w:rPr>
+        <w:t xml:space="preserve"> la langue du jeu ou </w:t>
+      </w:r>
+      <w:r>
+        <w:rPr>
+          <w:rFonts w:ascii="Calibri" w:hAnsi="Calibri" w:cs="Calibri"/>
+        </w:rPr>
+        <w:t>des</w:t>
+      </w:r>
+      <w:r>
+        <w:rPr>
+          <w:rFonts w:ascii="Calibri" w:hAnsi="Calibri" w:cs="Calibri"/>
+        </w:rPr>
+        <w:t xml:space="preserve"> contrôles</w:t>
+      </w:r>
+      <w:r>
+        <w:rPr>
+          <w:rFonts w:ascii="Calibri" w:hAnsi="Calibri" w:cs="Calibri"/>
+        </w:rPr>
+        <w:t xml:space="preserve"> est présent</w:t>
       </w:r>
     </w:p>
     <w:p>
@@ -5959,27 +6225,34 @@
           <w:ilvl w:val="0"/>
           <w:numId w:val="26"/>
         </w:numPr>
-        <w:rPr>
-          <w:rFonts w:ascii="Calibri" w:hAnsi="Calibri" w:cs="Calibri"/>
-        </w:rPr>
-      </w:pPr>
-      <w:r>
-        <w:rPr>
-          <w:rFonts w:ascii="Calibri" w:hAnsi="Calibri" w:cs="Calibri"/>
-        </w:rPr>
-        <w:t xml:space="preserve">Sur l'interface je veux un bouton pour accéder </w:t>
-      </w:r>
-      <w:r>
-        <w:rPr>
-          <w:rFonts w:ascii="Calibri" w:hAnsi="Calibri" w:cs="Calibri"/>
-        </w:rPr>
-        <w:t>aux crédits</w:t>
-      </w:r>
-      <w:r>
-        <w:rPr>
-          <w:rFonts w:ascii="Calibri" w:hAnsi="Calibri" w:cs="Calibri"/>
-        </w:rPr>
-        <w:t xml:space="preserve"> du jeux</w:t>
+        <w:jc w:val="both"/>
+        <w:rPr>
+          <w:rFonts w:ascii="Calibri" w:hAnsi="Calibri" w:cs="Calibri"/>
+        </w:rPr>
+      </w:pPr>
+      <w:r>
+        <w:rPr>
+          <w:rFonts w:ascii="Calibri" w:hAnsi="Calibri" w:cs="Calibri"/>
+        </w:rPr>
+        <w:t xml:space="preserve">Sur l'interface bouton </w:t>
+      </w:r>
+      <w:r>
+        <w:rPr>
+          <w:rFonts w:ascii="Calibri" w:hAnsi="Calibri" w:cs="Calibri"/>
+        </w:rPr>
+        <w:t>qui permet d’</w:t>
+      </w:r>
+      <w:r>
+        <w:rPr>
+          <w:rFonts w:ascii="Calibri" w:hAnsi="Calibri" w:cs="Calibri"/>
+        </w:rPr>
+        <w:t>accéder aux crédits du jeux</w:t>
+      </w:r>
+      <w:r>
+        <w:rPr>
+          <w:rFonts w:ascii="Calibri" w:hAnsi="Calibri" w:cs="Calibri"/>
+        </w:rPr>
+        <w:t xml:space="preserve"> est présent</w:t>
       </w:r>
     </w:p>
     <w:p>
@@ -5989,15 +6262,34 @@
           <w:ilvl w:val="0"/>
           <w:numId w:val="26"/>
         </w:numPr>
-        <w:rPr>
-          <w:rFonts w:ascii="Calibri" w:hAnsi="Calibri" w:cs="Calibri"/>
-        </w:rPr>
-      </w:pPr>
-      <w:r>
-        <w:rPr>
-          <w:rFonts w:ascii="Calibri" w:hAnsi="Calibri" w:cs="Calibri"/>
-        </w:rPr>
-        <w:t>Je veux pouvoir naviguer dans cette interface via les flèches directionnel "→", "←", "↑", "↓" et "ENTRER" ou "Curseur de la souris" pour sélectionner une option</w:t>
+        <w:jc w:val="both"/>
+        <w:rPr>
+          <w:rFonts w:ascii="Calibri" w:hAnsi="Calibri" w:cs="Calibri"/>
+        </w:rPr>
+      </w:pPr>
+      <w:r>
+        <w:rPr>
+          <w:rFonts w:ascii="Calibri" w:hAnsi="Calibri" w:cs="Calibri"/>
+        </w:rPr>
+        <w:t>D</w:t>
+      </w:r>
+      <w:r>
+        <w:rPr>
+          <w:rFonts w:ascii="Calibri" w:hAnsi="Calibri" w:cs="Calibri"/>
+        </w:rPr>
+        <w:t xml:space="preserve">ans cette interface </w:t>
+      </w:r>
+      <w:r>
+        <w:rPr>
+          <w:rFonts w:ascii="Calibri" w:hAnsi="Calibri" w:cs="Calibri"/>
+        </w:rPr>
+        <w:t xml:space="preserve">la navigation est possible </w:t>
+      </w:r>
+      <w:r>
+        <w:rPr>
+          <w:rFonts w:ascii="Calibri" w:hAnsi="Calibri" w:cs="Calibri"/>
+        </w:rPr>
+        <w:t>via les flèches directionnel "→", "←", "↑", "↓" et "ENTRER" ou "Curseur de la souris" pour sélectionner une option</w:t>
       </w:r>
     </w:p>
     <w:p>
@@ -6013,6 +6305,7 @@
         <w:rPr>
           <w:b/>
           <w:bCs/>
+          <w:noProof/>
           <w:u w:val="single"/>
         </w:rPr>
         <w:drawing>
@@ -6107,7 +6400,7 @@
           <w:szCs w:val="36"/>
         </w:rPr>
       </w:pPr>
-      <w:bookmarkStart w:id="11" w:name="_Toc240030441"/>
+      <w:bookmarkStart w:id="11" w:name="_Toc240034960"/>
       <w:r>
         <w:rPr>
           <w:rFonts w:ascii="Calibri" w:hAnsi="Calibri" w:cs="Calibri"/>
@@ -6173,6 +6466,7 @@
     <w:p>
       <w:pPr>
         <w:ind w:left="284"/>
+        <w:jc w:val="both"/>
         <w:rPr>
           <w:rFonts w:ascii="Calibri" w:hAnsi="Calibri" w:cs="Calibri"/>
         </w:rPr>
@@ -6223,15 +6517,34 @@
           <w:ilvl w:val="0"/>
           <w:numId w:val="26"/>
         </w:numPr>
-        <w:rPr>
-          <w:rFonts w:ascii="Calibri" w:hAnsi="Calibri" w:cs="Calibri"/>
-        </w:rPr>
-      </w:pPr>
-      <w:r>
-        <w:rPr>
-          <w:rFonts w:ascii="Calibri" w:hAnsi="Calibri" w:cs="Calibri"/>
-        </w:rPr>
-        <w:t>Une fois mon personnage mort, je veux une interface</w:t>
+        <w:jc w:val="both"/>
+        <w:rPr>
+          <w:rFonts w:ascii="Calibri" w:hAnsi="Calibri" w:cs="Calibri"/>
+        </w:rPr>
+      </w:pPr>
+      <w:r>
+        <w:rPr>
+          <w:rFonts w:ascii="Calibri" w:hAnsi="Calibri" w:cs="Calibri"/>
+        </w:rPr>
+        <w:t xml:space="preserve">Une fois </w:t>
+      </w:r>
+      <w:r>
+        <w:rPr>
+          <w:rFonts w:ascii="Calibri" w:hAnsi="Calibri" w:cs="Calibri"/>
+        </w:rPr>
+        <w:t>le</w:t>
+      </w:r>
+      <w:r>
+        <w:rPr>
+          <w:rFonts w:ascii="Calibri" w:hAnsi="Calibri" w:cs="Calibri"/>
+        </w:rPr>
+        <w:t xml:space="preserve"> personnage mort, une interface</w:t>
+      </w:r>
+      <w:r>
+        <w:rPr>
+          <w:rFonts w:ascii="Calibri" w:hAnsi="Calibri" w:cs="Calibri"/>
+        </w:rPr>
+        <w:t xml:space="preserve"> de fin de partie s’affiche</w:t>
       </w:r>
     </w:p>
     <w:p>
@@ -6241,15 +6554,34 @@
           <w:ilvl w:val="0"/>
           <w:numId w:val="26"/>
         </w:numPr>
-        <w:rPr>
-          <w:rFonts w:ascii="Calibri" w:hAnsi="Calibri" w:cs="Calibri"/>
-        </w:rPr>
-      </w:pPr>
-      <w:r>
-        <w:rPr>
-          <w:rFonts w:ascii="Calibri" w:hAnsi="Calibri" w:cs="Calibri"/>
-        </w:rPr>
-        <w:t>Sur cette interface, je veux avoir un titre</w:t>
+        <w:jc w:val="both"/>
+        <w:rPr>
+          <w:rFonts w:ascii="Calibri" w:hAnsi="Calibri" w:cs="Calibri"/>
+        </w:rPr>
+      </w:pPr>
+      <w:r>
+        <w:rPr>
+          <w:rFonts w:ascii="Calibri" w:hAnsi="Calibri" w:cs="Calibri"/>
+        </w:rPr>
+        <w:t>C</w:t>
+      </w:r>
+      <w:r>
+        <w:rPr>
+          <w:rFonts w:ascii="Calibri" w:hAnsi="Calibri" w:cs="Calibri"/>
+        </w:rPr>
+        <w:t>ette interface</w:t>
+      </w:r>
+      <w:r>
+        <w:rPr>
+          <w:rFonts w:ascii="Calibri" w:hAnsi="Calibri" w:cs="Calibri"/>
+        </w:rPr>
+        <w:t xml:space="preserve"> possède</w:t>
+      </w:r>
+      <w:r>
+        <w:rPr>
+          <w:rFonts w:ascii="Calibri" w:hAnsi="Calibri" w:cs="Calibri"/>
+        </w:rPr>
+        <w:t xml:space="preserve"> un titre</w:t>
       </w:r>
     </w:p>
     <w:p>
@@ -6259,15 +6591,40 @@
           <w:ilvl w:val="0"/>
           <w:numId w:val="26"/>
         </w:numPr>
-        <w:rPr>
-          <w:rFonts w:ascii="Calibri" w:hAnsi="Calibri" w:cs="Calibri"/>
-        </w:rPr>
-      </w:pPr>
-      <w:r>
-        <w:rPr>
-          <w:rFonts w:ascii="Calibri" w:hAnsi="Calibri" w:cs="Calibri"/>
-        </w:rPr>
-        <w:t>Sur cette interface, je veux avoir mon score</w:t>
+        <w:jc w:val="both"/>
+        <w:rPr>
+          <w:rFonts w:ascii="Calibri" w:hAnsi="Calibri" w:cs="Calibri"/>
+        </w:rPr>
+      </w:pPr>
+      <w:r>
+        <w:rPr>
+          <w:rFonts w:ascii="Calibri" w:hAnsi="Calibri" w:cs="Calibri"/>
+        </w:rPr>
+        <w:t>Cette interface possède</w:t>
+      </w:r>
+      <w:r>
+        <w:rPr>
+          <w:rFonts w:ascii="Calibri" w:hAnsi="Calibri" w:cs="Calibri"/>
+        </w:rPr>
+        <w:t xml:space="preserve"> </w:t>
+      </w:r>
+      <w:r>
+        <w:rPr>
+          <w:rFonts w:ascii="Calibri" w:hAnsi="Calibri" w:cs="Calibri"/>
+        </w:rPr>
+        <w:t>le</w:t>
+      </w:r>
+      <w:r>
+        <w:rPr>
+          <w:rFonts w:ascii="Calibri" w:hAnsi="Calibri" w:cs="Calibri"/>
+        </w:rPr>
+        <w:t xml:space="preserve"> score</w:t>
+      </w:r>
+      <w:r>
+        <w:rPr>
+          <w:rFonts w:ascii="Calibri" w:hAnsi="Calibri" w:cs="Calibri"/>
+        </w:rPr>
+        <w:t xml:space="preserve"> de la partie</w:t>
       </w:r>
     </w:p>
     <w:p>
@@ -6277,15 +6634,52 @@
           <w:ilvl w:val="0"/>
           <w:numId w:val="26"/>
         </w:numPr>
-        <w:rPr>
-          <w:rFonts w:ascii="Calibri" w:hAnsi="Calibri" w:cs="Calibri"/>
-        </w:rPr>
-      </w:pPr>
-      <w:r>
-        <w:rPr>
-          <w:rFonts w:ascii="Calibri" w:hAnsi="Calibri" w:cs="Calibri"/>
-        </w:rPr>
-        <w:t>Sur cette interface, je veux avoir un bouton pour rejouer</w:t>
+        <w:jc w:val="both"/>
+        <w:rPr>
+          <w:rFonts w:ascii="Calibri" w:hAnsi="Calibri" w:cs="Calibri"/>
+        </w:rPr>
+      </w:pPr>
+      <w:r>
+        <w:rPr>
+          <w:rFonts w:ascii="Calibri" w:hAnsi="Calibri" w:cs="Calibri"/>
+        </w:rPr>
+        <w:t>Cette interface possède</w:t>
+      </w:r>
+      <w:r>
+        <w:rPr>
+          <w:rFonts w:ascii="Calibri" w:hAnsi="Calibri" w:cs="Calibri"/>
+        </w:rPr>
+        <w:t xml:space="preserve"> un bouton </w:t>
+      </w:r>
+      <w:r>
+        <w:rPr>
+          <w:rFonts w:ascii="Calibri" w:hAnsi="Calibri" w:cs="Calibri"/>
+        </w:rPr>
+        <w:t>qui permet</w:t>
+      </w:r>
+      <w:r>
+        <w:rPr>
+          <w:rFonts w:ascii="Calibri" w:hAnsi="Calibri" w:cs="Calibri"/>
+        </w:rPr>
+        <w:t xml:space="preserve"> </w:t>
+      </w:r>
+      <w:r>
+        <w:rPr>
+          <w:rFonts w:ascii="Calibri" w:hAnsi="Calibri" w:cs="Calibri"/>
+        </w:rPr>
+        <w:t xml:space="preserve">de </w:t>
+      </w:r>
+      <w:r>
+        <w:rPr>
+          <w:rFonts w:ascii="Calibri" w:hAnsi="Calibri" w:cs="Calibri"/>
+        </w:rPr>
+        <w:t>rejouer</w:t>
+      </w:r>
+      <w:r>
+        <w:rPr>
+          <w:rFonts w:ascii="Calibri" w:hAnsi="Calibri" w:cs="Calibri"/>
+        </w:rPr>
+        <w:t xml:space="preserve"> une partie</w:t>
       </w:r>
     </w:p>
     <w:p>
@@ -6295,6 +6689,7 @@
           <w:ilvl w:val="0"/>
           <w:numId w:val="26"/>
         </w:numPr>
+        <w:jc w:val="both"/>
         <w:rPr>
           <w:rFonts w:ascii="Calibri" w:hAnsi="Calibri" w:cs="Calibri"/>
         </w:rPr>
@@ -6304,23 +6699,19 @@
           <w:rFonts w:ascii="Calibri" w:hAnsi="Calibri" w:cs="Calibri"/>
         </w:rPr>
         <w:lastRenderedPageBreak/>
-        <w:t xml:space="preserve">Sur cette interface, je veux avoir un bouton pour me ramener </w:t>
-      </w:r>
-      <w:proofErr w:type="spellStart"/>
-      <w:proofErr w:type="gramStart"/>
-      <w:r>
-        <w:rPr>
-          <w:rFonts w:ascii="Calibri" w:hAnsi="Calibri" w:cs="Calibri"/>
-        </w:rPr>
-        <w:t>a</w:t>
-      </w:r>
-      <w:proofErr w:type="spellEnd"/>
-      <w:proofErr w:type="gramEnd"/>
-      <w:r>
-        <w:rPr>
-          <w:rFonts w:ascii="Calibri" w:hAnsi="Calibri" w:cs="Calibri"/>
-        </w:rPr>
-        <w:t xml:space="preserve"> la page d'accueil</w:t>
+        <w:t>Cette interface possède</w:t>
+      </w:r>
+      <w:r>
+        <w:rPr>
+          <w:rFonts w:ascii="Calibri" w:hAnsi="Calibri" w:cs="Calibri"/>
+        </w:rPr>
+        <w:t xml:space="preserve"> un bouton </w:t>
+      </w:r>
+      <w:r>
+        <w:rPr>
+          <w:rFonts w:ascii="Calibri" w:hAnsi="Calibri" w:cs="Calibri"/>
+        </w:rPr>
+        <w:t>qui permet de rediriger le joueur sur la page d’accueil du jeu</w:t>
       </w:r>
     </w:p>
     <w:p>
@@ -6335,6 +6726,7 @@
         <w:rPr>
           <w:b/>
           <w:bCs/>
+          <w:noProof/>
           <w:u w:val="single"/>
         </w:rPr>
         <w:drawing>
@@ -6444,7 +6836,7 @@
           <w:bCs/>
         </w:rPr>
       </w:pPr>
-      <w:bookmarkStart w:id="12" w:name="_Toc240030442"/>
+      <w:bookmarkStart w:id="12" w:name="_Toc240034961"/>
       <w:r>
         <w:rPr>
           <w:rFonts w:ascii="Calibri" w:hAnsi="Calibri" w:cs="Calibri"/>
@@ -6732,13 +7124,14 @@
           <w:bCs/>
         </w:rPr>
       </w:pPr>
-      <w:bookmarkStart w:id="13" w:name="_Toc240030443"/>
-      <w:r>
-        <w:rPr>
-          <w:rFonts w:ascii="Calibri" w:hAnsi="Calibri" w:cs="Calibri"/>
-          <w:b/>
-          <w:bCs/>
-        </w:rPr>
+      <w:bookmarkStart w:id="13" w:name="_Toc240034962"/>
+      <w:r>
+        <w:rPr>
+          <w:rFonts w:ascii="Calibri" w:hAnsi="Calibri" w:cs="Calibri"/>
+          <w:b/>
+          <w:bCs/>
+        </w:rPr>
+        <w:lastRenderedPageBreak/>
         <w:t>4. Utilisation de l’AI</w:t>
       </w:r>
       <w:bookmarkEnd w:id="13"/>
@@ -6753,7 +7146,7 @@
           <w:bCs/>
         </w:rPr>
       </w:pPr>
-      <w:bookmarkStart w:id="14" w:name="_Toc240030444"/>
+      <w:bookmarkStart w:id="14" w:name="_Toc240034963"/>
       <w:r>
         <w:rPr>
           <w:rFonts w:ascii="Calibri" w:hAnsi="Calibri" w:cs="Calibri"/>
@@ -6784,7 +7177,7 @@
           <w:szCs w:val="36"/>
         </w:rPr>
       </w:pPr>
-      <w:bookmarkStart w:id="15" w:name="_Toc240030445"/>
+      <w:bookmarkStart w:id="15" w:name="_Toc240034964"/>
       <w:r>
         <w:rPr>
           <w:rFonts w:ascii="Calibri" w:hAnsi="Calibri" w:cs="Calibri"/>
@@ -6819,7 +7212,7 @@
           <w:szCs w:val="36"/>
         </w:rPr>
       </w:pPr>
-      <w:bookmarkStart w:id="16" w:name="_Toc240030446"/>
+      <w:bookmarkStart w:id="16" w:name="_Toc240034965"/>
       <w:r>
         <w:rPr>
           <w:rFonts w:ascii="Calibri" w:hAnsi="Calibri" w:cs="Calibri"/>
@@ -6862,7 +7255,7 @@
           <w:bCs/>
         </w:rPr>
       </w:pPr>
-      <w:bookmarkStart w:id="17" w:name="_Toc240030447"/>
+      <w:bookmarkStart w:id="17" w:name="_Toc240034966"/>
       <w:r>
         <w:rPr>
           <w:rFonts w:ascii="Calibri" w:hAnsi="Calibri" w:cs="Calibri"/>
@@ -6891,7 +7284,7 @@
           <w:bCs/>
         </w:rPr>
       </w:pPr>
-      <w:bookmarkStart w:id="18" w:name="_Toc240030448"/>
+      <w:bookmarkStart w:id="18" w:name="_Toc240034967"/>
       <w:r>
         <w:rPr>
           <w:rFonts w:ascii="Calibri" w:hAnsi="Calibri" w:cs="Calibri"/>
@@ -10739,6 +11132,7 @@
   <w:style w:type="character" w:default="1" w:styleId="Policepardfaut">
     <w:name w:val="Default Paragraph Font"/>
     <w:uiPriority w:val="1"/>
+    <w:semiHidden/>
     <w:unhideWhenUsed/>
   </w:style>
   <w:style w:type="table" w:default="1" w:styleId="TableauNormal">

</xml_diff>